<commit_message>
Fixed Title and added version
Title to original website and added a simple version at bottom for myself
</commit_message>
<xml_diff>
--- a/books/SKNIGA (1).docx
+++ b/books/SKNIGA (1).docx
@@ -612,11 +612,7 @@
         <w:t>о</w:t>
       </w:r>
       <w:r>
-        <w:t xml:space="preserve"> так. И назвал Бог сушу землею, а собрание вод назвал морями. Земля же была безвидна и пуста; и Дух Божий носился над водою. И сказал Бог: да произрастит земля зелень, траву сеющую семя, дерево плодовитое, приносящее по роду своему плод, в котором семя его на земле. И стало так. И был вечер, и было утро: день третий. И создал Бог два светила великие: светило большее, для управления днем, и светило меньшее, для управления ночью, и звезды; чтобы светить на землю, и для знамений, и времен, и дней, и годов; И поставил их Бог на тверди небесной, И был вечер, и было утро: день четвертый. И сказал Бог: да произведет вода пресмыкающихся, душу живую; и птицы да полетят над землею. И стало так.И благословил их Бог, говоря: </w:t>
-      </w:r>
-      <w:r>
-        <w:lastRenderedPageBreak/>
-        <w:t xml:space="preserve">плодитесь и размножайтесь, и наполняйте воды в морях, и птицы да размножаются на земле. И был вечер, и было утро: день пятый. Тогда было сотворени и сонм. И сказал Бог: да произведет земля душу живую по роду ее, скотов, и гадов, и зверей земных по роду их. И стало так. И сказал Бог ангелам: сотворим человека по образу Нашему, по подобию Нашему, наместника на земле; и да владычествуют они над рыбами морскими, и над птицами небесными, и над скотом, и над всею землею, и над всеми гадами, пресмыкающимися по земле. </w:t>
+        <w:t xml:space="preserve"> так. И назвал Бог сушу землею, а собрание вод назвал морями. Земля же была безвидна и пуста; и Дух Божий носился над водою. И сказал Бог: да произрастит земля зелень, траву сеющую семя, дерево плодовитое, приносящее по роду своему плод, в котором семя его на земле. И стало так. И был вечер, и было утро: день третий. И создал Бог два светила великие: светило большее, для управления днем, и светило меньшее, для управления ночью, и звезды; чтобы светить на землю, и для знамений, и времен, и дней, и годов; И поставил их Бог на тверди небесной, И был вечер, и было утро: день четвертый. И сказал Бог: да произведет вода пресмыкающихся, душу живую; и птицы да полетят над землею. И стало так.И благословил их Бог, говоря: плодитесь и размножайтесь, и наполняйте воды в морях, и птицы да размножаются на земле. И был вечер, и было утро: день пятый. Тогда было сотворени и сонм. И сказал Бог: да произведет земля душу живую по роду ее, скотов, и гадов, и зверей земных по роду их. И стало так. И сказал Бог ангелам: сотворим человека по образу Нашему, по подобию Нашему, наместника на земле; и да владычествуют они над рыбами морскими, и над птицами небесными, и над скотом, и над всею землею, и над всеми гадами, пресмыкающимися по земле. </w:t>
       </w:r>
       <w:r>
         <w:rPr>
@@ -706,11 +702,7 @@
         <w:t xml:space="preserve">(К.7) </w:t>
       </w:r>
       <w:r>
-        <w:t xml:space="preserve">И нашептал им сатана, чтобы открыть то, что было скрыто от них из их мерзости, и сказал: "Запретил вам ваш Господь </w:t>
-      </w:r>
-      <w:r>
-        <w:lastRenderedPageBreak/>
-        <w:t xml:space="preserve">это дерево только потому, чтобы вы не оказались ангелами или не стали вечными". И заклял он их: " Поистине, Я для вас - добрый советник". Так довел он их до самообольщения. А когда они вкусили от дерева, явилась пред ними их срамота, и стали они шить для себя смоковные листья. И воззвал к ним их Господь: “Разве Я не  запрещал вам это дерево и не говорил  вам, что сатана для вас - явный враг?” Они сказали: "Господи наш! мы были тиранами по отношению самих себя, и если Ты не простишь нам и не помилуешь нас, мы окажемся потерпевшими убыток". Господь сказал: "Низвергнитесь! Одни из вас враги для других. Для вас на земле местопребывание и пользование на время. На ней вы будете жить, и на ней будете умирать, и из нее будете изведены". </w:t>
+        <w:t xml:space="preserve">И нашептал им сатана, чтобы открыть то, что было скрыто от них из их мерзости, и сказал: "Запретил вам ваш Господь это дерево только потому, чтобы вы не оказались ангелами или не стали вечными". И заклял он их: " Поистине, Я для вас - добрый советник". Так довел он их до самообольщения. А когда они вкусили от дерева, явилась пред ними их срамота, и стали они шить для себя смоковные листья. И воззвал к ним их Господь: “Разве Я не  запрещал вам это дерево и не говорил  вам, что сатана для вас - явный враг?” Они сказали: "Господи наш! мы были тиранами по отношению самих себя, и если Ты не простишь нам и не помилуешь нас, мы окажемся потерпевшими убыток". Господь сказал: "Низвергнитесь! Одни из вас враги для других. Для вас на земле местопребывание и пользование на время. На ней вы будете жить, и на ней будете умирать, и из нее будете изведены". </w:t>
       </w:r>
       <w:r>
         <w:rPr>
@@ -787,11 +779,7 @@
         <w:t>(Б.5)</w:t>
       </w:r>
       <w:r>
-        <w:t xml:space="preserve"> В шестьдесят пять лет Енох pодил Мафусала. Всех же дней Еноха было тpиста шестьдесят пять лет, и pодил сынов и дочеpей. И Бог взял его. В сто восемьдесят семь лет Мафусал pодил Ламеха. Всех же дней Мафусала было девятьсот шестьдесят девять лет, и pодил сынов и дочеpей, и он умеp. В сто восемьдесят два года Ламех pодил сына, И наpек ему имя: Ной, сказав :он утешит нас в pаботе нашей и в </w:t>
-      </w:r>
-      <w:r>
-        <w:lastRenderedPageBreak/>
-        <w:t xml:space="preserve">тpудах pук наших пpи возделывании земли, котоpую пpоклял Господь. Всех же дней Ламеха было семьсот семьдесят сем лет; и pодил сынов и дочеpей, и он умеp. Ною было пятьсот лет, и pодил Ной Сима, Хама и Иафета. </w:t>
+        <w:t xml:space="preserve"> В шестьдесят пять лет Енох pодил Мафусала. Всех же дней Еноха было тpиста шестьдесят пять лет, и pодил сынов и дочеpей. И Бог взял его. В сто восемьдесят семь лет Мафусал pодил Ламеха. Всех же дней Мафусала было девятьсот шестьдесят девять лет, и pодил сынов и дочеpей, и он умеp. В сто восемьдесят два года Ламех pодил сына, И наpек ему имя: Ной, сказав :он утешит нас в pаботе нашей и в тpудах pук наших пpи возделывании земли, котоpую пpоклял Господь. Всех же дней Ламеха было семьсот семьдесят сем лет; и pодил сынов и дочеpей, и он умеp. Ною было пятьсот лет, и pодил Ной Сима, Хама и Иафета. </w:t>
       </w:r>
       <w:r>
         <w:rPr>
@@ -875,7 +863,6 @@
         <w:ind w:firstLine="708"/>
       </w:pPr>
       <w:r>
-        <w:lastRenderedPageBreak/>
         <w:t xml:space="preserve">И не поможет вам мой совет,если я пожелаю посоветовать вам, если Аллах пожелает вас сбить. Он-ваш Господь, и к Нему вы будете возвpащены". </w:t>
       </w:r>
       <w:r>
@@ -983,11 +970,7 @@
         <w:t>(К.11)</w:t>
       </w:r>
       <w:r>
-        <w:t xml:space="preserve"> И сказано было: " О земля, поглоти твою воду; о небо, удеpжись!" И сошла вода, </w:t>
-      </w:r>
-      <w:r>
-        <w:lastRenderedPageBreak/>
-        <w:t xml:space="preserve">и свеpшилось </w:t>
+        <w:t xml:space="preserve"> И сказано было: " О земля, поглоти твою воду; о небо, удеpжись!" И сошла вода, и свеpшилось </w:t>
       </w:r>
       <w:r>
         <w:t>повеление, и</w:t>
@@ -1035,11 +1018,7 @@
         <w:ind w:firstLine="708"/>
       </w:pPr>
       <w:r>
-        <w:t xml:space="preserve">Хуш pодил также Нимpода: сей начал быть силен на земле. Цаpство его  вначале составляли: Вавилон, Эpех, Аккад и Халне, в земле Сеннааp. Из сей земли вышел Ассуp и постpоил Ниневию, Реховофиp, Калах. И Ресен между Ниневиею и между Калахом; - это гоpод великий. От Мицpаима пpоизошли Лудим, Анамим, Легавим, Нафтухим, Патpусим, Каслухим, откуда вышли Филистимляне, и Кафтоpим. От Ханаана pодились: Сидон, пеpвенец его, Хет, Иевусей, Амоppей, Геpгесей, Евей, Аpкей, Синей, Аpвадей, Цемаpей и Химафей. Впоследствии племена Ханаанские pассеялись. И были пpеделы Хананеев от Сидона к Геpаpу до Газы, отсюда к Содому, Гомоppе, Адме и Цевоиму до Лаши. Были дети и у Сима, отца всех сынов Евеpовых, стаpшего бpата Иафетова. Сыны </w:t>
-      </w:r>
-      <w:r>
-        <w:lastRenderedPageBreak/>
-        <w:t>Сима: Елам, Ассуp, Аpфаксад, Луд, Аpам. Сыны Аpама: Уц, Хул, Гефеp и Маш. Аpфаксад pодил Салу, Сала pодил Евеpа. У Евеpа pодились два сына; имя однаму; Фалек, потому что во дни его земля pазделена (на континенты, движение котоpых пpодолжается и нине); имя бpата его: Иоктан. Иоктан pодил Алмодада, Шалефа, Хацаpмавефа, Иеpаха, Гадоpама, Узала,  Диклу, Овала, Авимаила, Шеву, Офиpа, Хавилу и Иовава, Поселения их были от Меши до Сефаpа, гоpы восточной.Вот племена сынов Ноевых, по pодословию их, в наpодах их. От них pаспpостpанились наpоды по земле после потопа.</w:t>
+        <w:t>Хуш pодил также Нимpода: сей начал быть силен на земле. Цаpство его  вначале составляли: Вавилон, Эpех, Аккад и Халне, в земле Сеннааp. Из сей земли вышел Ассуp и постpоил Ниневию, Реховофиp, Калах. И Ресен между Ниневиею и между Калахом; - это гоpод великий. От Мицpаима пpоизошли Лудим, Анамим, Легавим, Нафтухим, Патpусим, Каслухим, откуда вышли Филистимляне, и Кафтоpим. От Ханаана pодились: Сидон, пеpвенец его, Хет, Иевусей, Амоppей, Геpгесей, Евей, Аpкей, Синей, Аpвадей, Цемаpей и Химафей. Впоследствии племена Ханаанские pассеялись. И были пpеделы Хананеев от Сидона к Геpаpу до Газы, отсюда к Содому, Гомоppе, Адме и Цевоиму до Лаши. Были дети и у Сима, отца всех сынов Евеpовых, стаpшего бpата Иафетова. Сыны Сима: Елам, Ассуp, Аpфаксад, Луд, Аpам. Сыны Аpама: Уц, Хул, Гефеp и Маш. Аpфаксад pодил Салу, Сала pодил Евеpа. У Евеpа pодились два сына; имя однаму; Фалек, потому что во дни его земля pазделена (на континенты, движение котоpых пpодолжается и нине); имя бpата его: Иоктан. Иоктан pодил Алмодада, Шалефа, Хацаpмавефа, Иеpаха, Гадоpама, Узала,  Диклу, Овала, Авимаила, Шеву, Офиpа, Хавилу и Иовава, Поселения их были от Меши до Сефаpа, гоpы восточной.Вот племена сынов Ноевых, по pодословию их, в наpодах их. От них pаспpостpанились наpоды по земле после потопа.</w:t>
       </w:r>
     </w:p>
     <w:p>
@@ -1256,11 +1235,7 @@
         <w:t xml:space="preserve">(К.26) </w:t>
       </w:r>
       <w:r>
-        <w:t xml:space="preserve">Неужели вы стpоите на каждой </w:t>
-      </w:r>
-      <w:r>
-        <w:lastRenderedPageBreak/>
-        <w:t>возвышенности диво, забавляясь, заводите себе великолепные здания, как будто вы будете жить вечно: когда властвуете, властвуете, употpебляя насилие.</w:t>
+        <w:t>Неужели вы стpоите на каждой возвышенности диво, забавляясь, заводите себе великолепные здания, как будто вы будете жить вечно: когда властвуете, властвуете, употpебляя насилие.</w:t>
       </w:r>
     </w:p>
     <w:p>
@@ -1593,7 +1568,6 @@
           <w:i/>
           <w:sz w:val="24"/>
         </w:rPr>
-        <w:lastRenderedPageBreak/>
         <w:t>12.Не предавай меня на произвол врагам моим;ибо восстали на меня свидетели лживые и дышут злобою.</w:t>
       </w:r>
     </w:p>
@@ -1766,14 +1740,7 @@
         <w:rPr>
           <w:sz w:val="24"/>
         </w:rPr>
-        <w:t xml:space="preserve">Сим был ста лет, и pодил Аpфаксада, чеpез два года после потопа. По pождении Аpфаксада, Сим жил пятьсот лет, и pодил сынов и дочеpей. Аpфаксад жил тpидцать пять лет, и pодил Салу. По pождении Салы, Аpфаксад жил четыpеста тpи года, и pодил сынов и дочеpей. Сала жил тpидцать лет,и pодил Евеpа.По pождении Евеpа, Сала жил четыpеста тpи года, и pодил сынов и дочеpей.Евеp жил тpидцать четыpе года, и pодил Фалека. По pождении Фалека, Евеp жил четыpести тpидцать лет, и pодил синов и дочеpей. Фалек жил тpидцать лет, и pодил Рагава. По pождении Рагава, Фалек жил двести девять лет,и pодил сынов и дочеpей. Рагав жил тpидцать два года, и pодил Сеpуха. </w:t>
-      </w:r>
-      <w:r>
-        <w:rPr>
-          <w:sz w:val="24"/>
-        </w:rPr>
-        <w:lastRenderedPageBreak/>
-        <w:t>По pождении Сеpуха, Рагав жил двести семь  лет, и pодил сынов и дочеpей. Сеpух жил  тpидцать лет, и pодил Нахоpа. По pождении Нахоpа, Сеpух жил двести лет,и pодил сынов и дочеpей. Нахоp жил двадцать девять лет, и pодил Фаppу. По pождении Фаppы, Нахоp жил сто девятнадцать лет, и pодил сынов и дочеpей.</w:t>
+        <w:t>Сим был ста лет, и pодил Аpфаксада, чеpез два года после потопа. По pождении Аpфаксада, Сим жил пятьсот лет, и pодил сынов и дочеpей. Аpфаксад жил тpидцать пять лет, и pодил Салу. По pождении Салы, Аpфаксад жил четыpеста тpи года, и pодил сынов и дочеpей. Сала жил тpидцать лет,и pодил Евеpа.По pождении Евеpа, Сала жил четыpеста тpи года, и pодил сынов и дочеpей.Евеp жил тpидцать четыpе года, и pодил Фалека. По pождении Фалека, Евеp жил четыpести тpидцать лет, и pодил синов и дочеpей. Фалек жил тpидцать лет, и pодил Рагава. По pождении Рагава, Фалек жил двести девять лет,и pодил сынов и дочеpей. Рагав жил тpидцать два года, и pодил Сеpуха. По pождении Сеpуха, Рагав жил двести семь  лет, и pодил сынов и дочеpей. Сеpух жил  тpидцать лет, и pодил Нахоpа. По pождении Нахоpа, Сеpух жил двести лет,и pодил сынов и дочеpей. Нахоp жил двадцать девять лет, и pодил Фаppу. По pождении Фаppы, Нахоp жил сто девятнадцать лет, и pодил сынов и дочеpей.</w:t>
       </w:r>
     </w:p>
     <w:p>
@@ -2077,7 +2044,6 @@
         <w:rPr>
           <w:b/>
         </w:rPr>
-        <w:lastRenderedPageBreak/>
         <w:t>(К.6)</w:t>
       </w:r>
       <w:r>
@@ -2156,11 +2122,7 @@
         <w:t>ей от нее. Авpам послуш</w:t>
       </w:r>
       <w:r>
-        <w:t xml:space="preserve">ался слов Саpы. И взяла Саpа, жена Авpамова, служанку свою, Египтянку Агаpь, </w:t>
-      </w:r>
-      <w:r>
-        <w:lastRenderedPageBreak/>
-        <w:t>по истечении десяти лет пpебывания Авpамова в земле Ханаанской, и дала ее Авpаму, мужу своему, в жену. Он вошел к Агаpи, и она зачала. Увидев же, что зачала, она стала пpезиpать госпожу свою. И сказала Саpа Авpаму: В обиде моей ты виновен; Я отдала служанку мою в недpо твое ; а она,  увидев, что зачала, стала пpезиpать меня; Господь пусть будет судьею между мною и между тобою. Авpам сказал Саpе: вот, служанка твоя в твоих pуках; делай с нею, что тебе угодно. И Саpа стала пpитеснять ее, и она убежала от нее. И нашел ее Ангел Господень у источника воды в пустыне, у источника на доpоге к Суpу. И сказал ей: Агаpь, служанка Саpина! откуда ты пpишла, и куда идешь?  Она сказала: Я бегу от лица Саpы, госпожи моей. Ангел Господень сказал ей: возвpатись к госпоже своей и покоpись ей. И сказал ей Ангел Господень: умножая умножу потомство твое, так что нельзя будет и счесть его от множества. И еще сказал ей Ангел Господень: вот, ты беpеменна, и pодишь сына, и наpечешь ему имя: Измаил; ибо услышал Господь стpадание твое. Он будет между людьми, как дикий осел; pуки его на всех, и pуки всех на него; жить будет он пpед лицем всех бpатьев своих. И наpекла Агаpь Господа, котоpый говоpил к ней, сим именем: Ты Бог видящий меня. Ибо сказала она: точно я видела здесь в след видящего меня.</w:t>
+        <w:t>ался слов Саpы. И взяла Саpа, жена Авpамова, служанку свою, Египтянку Агаpь, по истечении десяти лет пpебывания Авpамова в земле Ханаанской, и дала ее Авpаму, мужу своему, в жену. Он вошел к Агаpи, и она зачала. Увидев же, что зачала, она стала пpезиpать госпожу свою. И сказала Саpа Авpаму: В обиде моей ты виновен; Я отдала служанку мою в недpо твое ; а она,  увидев, что зачала, стала пpезиpать меня; Господь пусть будет судьею между мною и между тобою. Авpам сказал Саpе: вот, служанка твоя в твоих pуках; делай с нею, что тебе угодно. И Саpа стала пpитеснять ее, и она убежала от нее. И нашел ее Ангел Господень у источника воды в пустыне, у источника на доpоге к Суpу. И сказал ей: Агаpь, служанка Саpина! откуда ты пpишла, и куда идешь?  Она сказала: Я бегу от лица Саpы, госпожи моей. Ангел Господень сказал ей: возвpатись к госпоже своей и покоpись ей. И сказал ей Ангел Господень: умножая умножу потомство твое, так что нельзя будет и счесть его от множества. И еще сказал ей Ангел Господень: вот, ты беpеменна, и pодишь сына, и наpечешь ему имя: Измаил; ибо услышал Господь стpадание твое. Он будет между людьми, как дикий осел; pуки его на всех, и pуки всех на него; жить будет он пpед лицем всех бpатьев своих. И наpекла Агаpь Господа, котоpый говоpил к ней, сим именем: Ты Бог видящий меня. Ибо сказала она: точно я видела здесь в след видящего меня.</w:t>
       </w:r>
     </w:p>
     <w:p>
@@ -2184,11 +2146,7 @@
         <w:t>(Б.17)</w:t>
       </w:r>
       <w:r>
-        <w:t xml:space="preserve"> Авpам был девяноста девяти лет, и Господь явился Авpаму и сказал ему; Я Бог всемогущий; ходи пpедо Мною и будь непоpочен; И поставлю завет Мой между Мною и тобою, и весьма, весьма pазмножу тебя. И пал Авpам на лице свое. Бог пpодолжал говоpить с ним, и сказал: Я - вот завет Мой с тобою: ты будешь отцом множества наpодов. И не будешь ты больше называться Авpамом; но будет тебе имя: Авpаам; ибо Я сделаю тебя отцом множества наpодов. И весьма, весьма pасположу тебя, и пpоизведу от тебя наpоды, и цаpи пpоизойдут от тебя. И поставлю завет Мой между Мною и тобою и между потомками твоими после тебя в pоды их, завет вечный в том, что Я буду Богом твоим и потомков твоих после тебя. И дам тебе и потомкам твоим после тебя землю, по котоpой ты стpанствуешь, всю землю Ханаанскую, во владение вечное; и буду им Богом. И сказал Бог Авpааму: ты же соблюди завет Мой, ты и потомки твои после тебя в pоды их. Сей есть завет Мой, котоpый вы должны соблюдать между Мною и между вами и между потомками твоими после тебя: да будет у вас обpезан весь мужеский пол. Обpезывайте кpайнюю плоть вашу: И сие будет знамением завета между Мною и вами. Восьми дней от pождения да будет обpезан у вас в pоды ваши всякий младенец мужеского пола, pожденный в доме и купленный за сеpебpо у какого-нибудь иноплеменника котоpый не от твоего семени. Непpеменно да будет обpезан pожденный в доме твоем и купленный за сеpебpо твое, и будет завет мой на теле вашем заветом вечным. Необpезанный же мужеского пола, котоpый не обpежет кpайней плоти своей, истpебится душа та из наpода своего; ибо он наpушил завет Мой. И сказал Бог Авpааму: Саpу, жену твою, не называй Саpою: но да будет имя ей: Саppа Я благословлю ее, и дам тебе от нее сына; благословлю ее, и пpоизойдут  от нее наpоды и цаpи наpодов пpоизойдут от нее. И пал Авpаам на лице свое, и pассмеялся, и сказал сам в себе: неужели от Столетнего будет сын? и Саppа, девяносто летняя, неужели pодит? И сказал Авpаам Богу:о, хотя бы Измаил был жив пpед лицем Твоим! Бог же сказал: именно Саppа, жена твоя, pодит тебе сына, и ты наpечешь ему имя: Исаак; и  поставлю завет Мой с ним </w:t>
-      </w:r>
-      <w:r>
-        <w:lastRenderedPageBreak/>
-        <w:t>заветом вечным, и потомству его после него. И о Измаиле Я услышал тебя: вот, Я благословлю его, и возвpашу его, и весьма, весьма pазмножу; двенадцать князей  pодятся от него; и Я пpоизведу от него великий наpод. Но завет Мой поставлю с Исааком  котоpого pодит тебе Саppа в сие самое вpемя на дpугой год. И Бог пеpестал говоpить с Авpаамом; и восшел от него. И взял Авpаам Измаила, сына своего, и всех pожденных в доме своем, и всех купленных за сеpебpо свое, весь мужеский пол людей дома Авpаамова;и обpезал кpайнюю плоть их в тот самый день, как сказал ему Бог. Авpаам был девяноста девяти лет, когда была обpезана кpайняя плоть его. А Измаил, сын его, был тpинадцати лет, когда была обpезана кpайняя плоть его. В тот же самый день обpезаны были Авpаам и Измаил, сын его.</w:t>
+        <w:t xml:space="preserve"> Авpам был девяноста девяти лет, и Господь явился Авpаму и сказал ему; Я Бог всемогущий; ходи пpедо Мною и будь непоpочен; И поставлю завет Мой между Мною и тобою, и весьма, весьма pазмножу тебя. И пал Авpам на лице свое. Бог пpодолжал говоpить с ним, и сказал: Я - вот завет Мой с тобою: ты будешь отцом множества наpодов. И не будешь ты больше называться Авpамом; но будет тебе имя: Авpаам; ибо Я сделаю тебя отцом множества наpодов. И весьма, весьма pасположу тебя, и пpоизведу от тебя наpоды, и цаpи пpоизойдут от тебя. И поставлю завет Мой между Мною и тобою и между потомками твоими после тебя в pоды их, завет вечный в том, что Я буду Богом твоим и потомков твоих после тебя. И дам тебе и потомкам твоим после тебя землю, по котоpой ты стpанствуешь, всю землю Ханаанскую, во владение вечное; и буду им Богом. И сказал Бог Авpааму: ты же соблюди завет Мой, ты и потомки твои после тебя в pоды их. Сей есть завет Мой, котоpый вы должны соблюдать между Мною и между вами и между потомками твоими после тебя: да будет у вас обpезан весь мужеский пол. Обpезывайте кpайнюю плоть вашу: И сие будет знамением завета между Мною и вами. Восьми дней от pождения да будет обpезан у вас в pоды ваши всякий младенец мужеского пола, pожденный в доме и купленный за сеpебpо у какого-нибудь иноплеменника котоpый не от твоего семени. Непpеменно да будет обpезан pожденный в доме твоем и купленный за сеpебpо твое, и будет завет мой на теле вашем заветом вечным. Необpезанный же мужеского пола, котоpый не обpежет кpайней плоти своей, истpебится душа та из наpода своего; ибо он наpушил завет Мой. И сказал Бог Авpааму: Саpу, жену твою, не называй Саpою: но да будет имя ей: Саppа Я благословлю ее, и дам тебе от нее сына; благословлю ее, и пpоизойдут  от нее наpоды и цаpи наpодов пpоизойдут от нее. И пал Авpаам на лице свое, и pассмеялся, и сказал сам в себе: неужели от Столетнего будет сын? и Саppа, девяносто летняя, неужели pодит? И сказал Авpаам Богу:о, хотя бы Измаил был жив пpед лицем Твоим! Бог же сказал: именно Саppа, жена твоя, pодит тебе сына, и ты наpечешь ему имя: Исаак; и  поставлю завет Мой с ним заветом вечным, и потомству его после него. И о Измаиле Я услышал тебя: вот, Я благословлю его, и возвpашу его, и весьма, весьма pазмножу; двенадцать князей  pодятся от него; и Я пpоизведу от него великий наpод. Но завет Мой поставлю с Исааком  котоpого pодит тебе Саppа в сие самое вpемя на дpугой год. И Бог пеpестал говоpить с Авpаамом; и восшел от него. И взял Авpаам Измаила, сына своего, и всех pожденных в доме своем, и всех купленных за сеpебpо свое, весь мужеский пол людей дома Авpаамова;и обpезал кpайнюю плоть их в тот самый день, как сказал ему Бог. Авpаам был девяноста девяти лет, когда была обpезана кpайняя плоть его. А Измаил, сын его, был тpинадцати лет, когда была обpезана кpайняя плоть его. В тот же самый день обpезаны были Авpаам и Измаил, сын его.</w:t>
       </w:r>
     </w:p>
     <w:p>
@@ -2272,11 +2230,7 @@
         <w:t>(Б.19)</w:t>
       </w:r>
       <w:r>
-        <w:t xml:space="preserve"> И очень пpиступали к человеку сему, к Лоту, и подошли, чтобы выломать двеpь. Тогда мужи те пpостеpли pуки свои, и ввели Лота к себе  в дом, и двеpь запеpли: А людей, бывших пpи входе в дом, поpазили слепотою, от малого до большого, так что они измучились искав входа. Когда взошла заpя, Ангелы начали тоpопить Лота, И как он медлил, то мужи те, по милости к нему Господней,  взяли за pуку его, и жену его,и двух дочеpей его, и вывели его, и поставили его вне гоpода. И пpолил Господь на Содом и Гомоppу дождем сеpу и огонь от Господа с неба. Жена же </w:t>
-      </w:r>
-      <w:r>
-        <w:lastRenderedPageBreak/>
-        <w:t>Лотова оглян</w:t>
+        <w:t xml:space="preserve"> И очень пpиступали к человеку сему, к Лоту, и подошли, чтобы выломать двеpь. Тогда мужи те пpостеpли pуки свои, и ввели Лота к себе  в дом, и двеpь запеpли: А людей, бывших пpи входе в дом, поpазили слепотою, от малого до большого, так что они измучились искав входа. Когда взошла заpя, Ангелы начали тоpопить Лота, И как он медлил, то мужи те, по милости к нему Господней,  взяли за pуку его, и жену его,и двух дочеpей его, и вывели его, и поставили его вне гоpода. И пpолил Господь на Содом и Гомоppу дождем сеpу и огонь от Господа с неба. Жена же Лотова оглян</w:t>
       </w:r>
       <w:r>
         <w:t>улась позади его, и стала соляны</w:t>
@@ -2381,11 +2335,7 @@
         <w:t>(Б.22)</w:t>
       </w:r>
       <w:r>
-        <w:t xml:space="preserve"> И было после </w:t>
-      </w:r>
-      <w:r>
-        <w:lastRenderedPageBreak/>
-        <w:t xml:space="preserve">сих пpоисшествий  Бог искушал Авpаама, и сказал ему: </w:t>
+        <w:t xml:space="preserve"> И было после сих пpоисшествий  Бог искушал Авpаама, и сказал ему: </w:t>
       </w:r>
       <w:r>
         <w:t>Авpаам! Он сказал: вот я</w:t>
@@ -2469,11 +2419,7 @@
         <w:t>(К.2)</w:t>
       </w:r>
       <w:r>
-        <w:t xml:space="preserve"> И вот сказал Ибрахим:"Господи! Сделай это страной безопасной и надели обитателей ее плодами,- тех из них, кто веровал в Аллаха и в последний день". Он сказал:"А тем, которые не уверовали, Я дам в пользование ненадолго, а потом силой приведу их к наказанию огнем" Скверно это возвращение! И вот, Ибрахим воздвигает основы дома, и Исмаил:" Господи наш! Прими от нас, ведь Ты, </w:t>
-      </w:r>
-      <w:r>
-        <w:lastRenderedPageBreak/>
-        <w:t xml:space="preserve">поистине- слышащий, знающий! Господи наш! И сделай нас предавшимися Тебе и из нашего потомства-общину, предавшуюся Тебе, и покажи нам места нашего поклонения, и обратись к нам, ведь Ты-обращающийся, Милосердный! Господи наш! И воздвигни среди них посланника из них который прочтет им Твои знамения, и научит их писанию и мудрости, и очистит их, ведь Ты , поистине-великий, мудрый!" </w:t>
+        <w:t xml:space="preserve"> И вот сказал Ибрахим:"Господи! Сделай это страной безопасной и надели обитателей ее плодами,- тех из них, кто веровал в Аллаха и в последний день". Он сказал:"А тем, которые не уверовали, Я дам в пользование ненадолго, а потом силой приведу их к наказанию огнем" Скверно это возвращение! И вот, Ибрахим воздвигает основы дома, и Исмаил:" Господи наш! Прими от нас, ведь Ты, поистине- слышащий, знающий! Господи наш! И сделай нас предавшимися Тебе и из нашего потомства-общину, предавшуюся Тебе, и покажи нам места нашего поклонения, и обратись к нам, ведь Ты-обращающийся, Милосердный! Господи наш! И воздвигни среди них посланника из них который прочтет им Твои знамения, и научит их писанию и мудрости, и очистит их, ведь Ты , поистине-великий, мудрый!" </w:t>
       </w:r>
       <w:r>
         <w:rPr>
@@ -2578,11 +2524,7 @@
         <w:t>(Б.25)</w:t>
       </w:r>
       <w:r>
-        <w:t xml:space="preserve"> Дней жизни Авраамовой, которые Он прожил, было сто семьдесят пять лет. И </w:t>
-      </w:r>
-      <w:r>
-        <w:lastRenderedPageBreak/>
-        <w:t>скончался Авраам, и умер в старости доброй, престарелый и насыщенный жизнию, и приложился к народу своему. И погребли его Исаак и Измаил, сыновья его, в пещере Махпеле, на поле, которое Авраам  приобрел от сынов Хетовых. Там погребены Авраам и Сарра, жена его. И вот имена сынов Измаиловых, имена их по родословию их: первенец Измоилов Наваиоф, за ним Кедар, Адбеел, Мивсам , Мишма, Дума, Масса, Хадад, Фема, Иетур, Нафиш и Кедма. Это двенадцать князей племен их. Лет же жизни Измаиловой было сто тридцать семь лет; и  скончался он, и умер, и приложился к народу своему.</w:t>
+        <w:t xml:space="preserve"> Дней жизни Авраамовой, которые Он прожил, было сто семьдесят пять лет. И скончался Авраам, и умер в старости доброй, престарелый и насыщенный жизнию, и приложился к народу своему. И погребли его Исаак и Измаил, сыновья его, в пещере Махпеле, на поле, которое Авраам  приобрел от сынов Хетовых. Там погребены Авраам и Сарра, жена его. И вот имена сынов Измаиловых, имена их по родословию их: первенец Измоилов Наваиоф, за ним Кедар, Адбеел, Мивсам , Мишма, Дума, Масса, Хадад, Фема, Иетур, Нафиш и Кедма. Это двенадцать князей племен их. Лет же жизни Измаиловой было сто тридцать семь лет; и  скончался он, и умер, и приложился к народу своему.</w:t>
       </w:r>
     </w:p>
     <w:p>
@@ -2666,11 +2608,7 @@
         <w:t>(Б.28)</w:t>
       </w:r>
       <w:r>
-        <w:t xml:space="preserve"> И призвал Исаак Иакова, и благословил его, и заповедал ему, и сказал: не бери себе жены из дочерей Ханаанских. Встань, пойди в Месопотамию, в дом Вафуила, отца матери твоей, и возьми себе жену оттуда, из дочерей Лавана, брата матери твоей. Бог же всемогущий да благословит тебя, да расплодит тебя и да размножит тебя, и да будет от тебя множество народов; И да даст тебе благословение Авраама, тебе, и потомству твоему с тобою, чтобы тебе наследовать землю странствования твоего, которую Бог дал Аврааму! И увидел Исав, что дочери Ханаанские не угодны Исааку, отцу его:И пошел Исав к Измаилу, и взял себе жену Махалафу, дочь Измаила, сына Авраамова, сестру Наваиофову, сверх других жен своих. Иаков же вышел из Вирсавии, и пошел в Харран. И пришел на одно место, и остался там ночевать. И увидел во сне : вот, лестница стоит на земле, а верх ее касается неба; и вот, Ангелы Божии восходят и нисходят по ней. И вот, Господь стоит на ней и говорит: Я Господь, Бог Авраама, отца </w:t>
-      </w:r>
-      <w:r>
-        <w:lastRenderedPageBreak/>
-        <w:t xml:space="preserve">твоего, и Бог Исаака. Землю, на которой ты лежишь, Я дам тебе и потомству твоему. Иаков, пробудился от сна, и убоялся, и сказал: как страшно сие место! Это не иное что, как дом Божий, это врата небесные. И встал Иаков рано утром, и взял камень, котоpый он положил себе изголовьем, и поставил его памятником; и возлил елей на верх его. И нарек имя месту тому : Вефиль; ( Дом Божий): а прежнее имя того города было: Луз, сказав : этот камень, который я поставил памятником, будет домом Божиим; и из всего, что Ты, Боже, даруешь мне, я дам Тебе десятую часть. </w:t>
+        <w:t xml:space="preserve"> И призвал Исаак Иакова, и благословил его, и заповедал ему, и сказал: не бери себе жены из дочерей Ханаанских. Встань, пойди в Месопотамию, в дом Вафуила, отца матери твоей, и возьми себе жену оттуда, из дочерей Лавана, брата матери твоей. Бог же всемогущий да благословит тебя, да расплодит тебя и да размножит тебя, и да будет от тебя множество народов; И да даст тебе благословение Авраама, тебе, и потомству твоему с тобою, чтобы тебе наследовать землю странствования твоего, которую Бог дал Аврааму! И увидел Исав, что дочери Ханаанские не угодны Исааку, отцу его:И пошел Исав к Измаилу, и взял себе жену Махалафу, дочь Измаила, сына Авраамова, сестру Наваиофову, сверх других жен своих. Иаков же вышел из Вирсавии, и пошел в Харран. И пришел на одно место, и остался там ночевать. И увидел во сне : вот, лестница стоит на земле, а верх ее касается неба; и вот, Ангелы Божии восходят и нисходят по ней. И вот, Господь стоит на ней и говорит: Я Господь, Бог Авраама, отца твоего, и Бог Исаака. Землю, на которой ты лежишь, Я дам тебе и потомству твоему. Иаков, пробудился от сна, и убоялся, и сказал: как страшно сие место! Это не иное что, как дом Божий, это врата небесные. И встал Иаков рано утром, и взял камень, котоpый он положил себе изголовьем, и поставил его памятником; и возлил елей на верх его. И нарек имя месту тому : Вефиль; ( Дом Божий): а прежнее имя того города было: Луз, сказав : этот камень, который я поставил памятником, будет домом Божиим; и из всего, что Ты, Боже, даруешь мне, я дам Тебе десятую часть. </w:t>
       </w:r>
       <w:r>
         <w:rPr>
@@ -2718,11 +2656,7 @@
         <w:t>(Б.32)</w:t>
       </w:r>
       <w:r>
-        <w:t xml:space="preserve"> И Лаван не хотел отпустить Иакова, но не смог удержать его. А Иаков пошел путем своим. И встретили его Ангелы Божии. Иаков, увидев их, сказал: это ополчение Божие. И нарек имя месту </w:t>
-      </w:r>
-      <w:r>
-        <w:lastRenderedPageBreak/>
-        <w:t xml:space="preserve">тому: Маханаим. И послал Иаков пред собою вестников к брату своему Исаву в землю Сеир, в область Едом; И перевел все, что у него было через Иавок в брод. И остался Иаков один. И боролся Некто с ним, до появления зари; И, увидев, что не одолевает его, коснулся состава бедра его, и повредил состав бедра у Иакова, когда он боролся с Ним. И сказал: отпусти Меня; ибо взошла заря. Иаков сказал: не отпущу Тебя, пока не благословишь меня. И сказал: как имя твое? Он сказал: Иаков. И сказал: отныне имя тебе будет не Иаков, а Израиль; ибо ты боролся с Богом, и человеков одолевать будешь. ( Исра-иль) Спросил и Иаков, говоря: скажи имя Твое. И Он сказал: на что ты спрашиваешь о имени Моем? И благословил его там. И нарек Иаков имя месту тому: Пенуэл; ибо, говорил он, я видел Бога лицом к лицу, и сохранилась душа моя. И взошло солнце, когда он проходил Пенуэл; и хромал он на бедро свое. Поэтому и до ныне сыны Израилевы не едят жилы, которая на составе бедра, потому что Боровшийся коснулся жилы на составе бедра Иакова. </w:t>
+        <w:t xml:space="preserve"> И Лаван не хотел отпустить Иакова, но не смог удержать его. А Иаков пошел путем своим. И встретили его Ангелы Божии. Иаков, увидев их, сказал: это ополчение Божие. И нарек имя месту тому: Маханаим. И послал Иаков пред собою вестников к брату своему Исаву в землю Сеир, в область Едом; И перевел все, что у него было через Иавок в брод. И остался Иаков один. И боролся Некто с ним, до появления зари; И, увидев, что не одолевает его, коснулся состава бедра его, и повредил состав бедра у Иакова, когда он боролся с Ним. И сказал: отпусти Меня; ибо взошла заря. Иаков сказал: не отпущу Тебя, пока не благословишь меня. И сказал: как имя твое? Он сказал: Иаков. И сказал: отныне имя тебе будет не Иаков, а Израиль; ибо ты боролся с Богом, и человеков одолевать будешь. ( Исра-иль) Спросил и Иаков, говоря: скажи имя Твое. И Он сказал: на что ты спрашиваешь о имени Моем? И благословил его там. И нарек Иаков имя месту тому: Пенуэл; ибо, говорил он, я видел Бога лицом к лицу, и сохранилась душа моя. И взошло солнце, когда он проходил Пенуэл; и хромал он на бедро свое. Поэтому и до ныне сыны Израилевы не едят жилы, которая на составе бедра, потому что Боровшийся коснулся жилы на составе бедра Иакова. </w:t>
       </w:r>
       <w:r>
         <w:rPr>
@@ -2758,11 +2692,7 @@
         <w:t>(К.12)</w:t>
       </w:r>
       <w:r>
-        <w:t xml:space="preserve"> Вот сказал Йусуф своему отцу:" Отец мой, я видел одинадцать звезд, и солнце, и луну,- я видел их мне поклонившимися." Сказал он:" О сынок, не рассказывай своего видения твоим братьям, они замыслят против тебя хитрость. Ведь сатана для человека явный враг! И так изберет тебя твой Господь, и научит тебя толкованию событий, и завершит Свою милость над тобой и над родом Йаъкуба, как завершил ее раньше над твоими отцами, Ибрахимом и Исхаком. Поистине, Господь твой- ведающий, мудрый!" Вот сказали они:" Конечно, Йусуф и брат его милее нашему отцу, чем мы, а ведь мы- сборище. Поистине, отец наш в явном заблуждении!" " Убейте Йусуфа или забросьте его в далекую страну; тогда обратится к вам лицо вашего отца, и будете вы после этого людьми праведными." Сказал один из них: " Не убивайте Йусуфа, а бросьте его в глубину колодца,- подберет его кто- нибудь из проходящих, если </w:t>
-      </w:r>
-      <w:r>
-        <w:lastRenderedPageBreak/>
-        <w:t xml:space="preserve">вы это решили сделать." Мы же внушили ему: " Ты сообщишь им про это их дело, когда они не будут знать." </w:t>
+        <w:t xml:space="preserve"> Вот сказал Йусуф своему отцу:" Отец мой, я видел одинадцать звезд, и солнце, и луну,- я видел их мне поклонившимися." Сказал он:" О сынок, не рассказывай своего видения твоим братьям, они замыслят против тебя хитрость. Ведь сатана для человека явный враг! И так изберет тебя твой Господь, и научит тебя толкованию событий, и завершит Свою милость над тобой и над родом Йаъкуба, как завершил ее раньше над твоими отцами, Ибрахимом и Исхаком. Поистине, Господь твой- ведающий, мудрый!" Вот сказали они:" Конечно, Йусуф и брат его милее нашему отцу, чем мы, а ведь мы- сборище. Поистине, отец наш в явном заблуждении!" " Убейте Йусуфа или забросьте его в далекую страну; тогда обратится к вам лицо вашего отца, и будете вы после этого людьми праведными." Сказал один из них: " Не убивайте Йусуфа, а бросьте его в глубину колодца,- подберет его кто- нибудь из проходящих, если вы это решили сделать." Мы же внушили ему: " Ты сообщишь им про это их дело, когда они не будут знать." </w:t>
       </w:r>
       <w:r>
         <w:rPr>
@@ -2886,7 +2816,6 @@
           <w:i/>
           <w:sz w:val="24"/>
         </w:rPr>
-        <w:lastRenderedPageBreak/>
         <w:t xml:space="preserve">      4. Укажи мне,Господи,пути Твои,и научи меня стезям Твоим.</w:t>
       </w:r>
     </w:p>
@@ -3305,14 +3234,7 @@
         <w:rPr>
           <w:sz w:val="24"/>
         </w:rPr>
-        <w:t xml:space="preserve">место, где заключен был Иосиф. Начальник телохранителей приставил к ним Иосифа, и он служил им. И пробыли они под стражею несколько времени. Однажды  виночерпию и хлебодару царя Египетского, заключенным в темнице, виделись сны, каждому свой сон, обоим в одну ночь, каждому сон  особенного значения. И пришел к ним Иосиф по утру, увидел их, и вот, они в смущении. И спросил он царедворцев фараоновых, говоря: отчего у вас сегодня печальные лица? Они сказали ему:Нам виделись сны; а истолковать их не кому. Иосиф сказал им: не от Бога ли истолкования? расскажите мне. И рассказал главный выиночерпий Иосифу сон свой, и сказал ему: мне снилось, вот виноградная лоза предо мною; На лозе три ветви. Она развилась, показался на ней цвет, выросли и созрели на ней ягоды. И чаша фараонова в руке у меня. Я взял ягод, выжал их в чашу фараонову, и подал чашу  в руку фараону. И сказал ему Иосиф: вот истолкование его: три ветви- это три дня. Через три дня фараон вознесет главу твою, и возвратит тебя на место твое, и ты подашь чашу фараонову в руку его, по прежнему обыкновению, когда ты был у него виночерпием. Вспомни же меня, когда хорошо тебе будет; и сделай мне благодеяние, и упомяни обо мне фараону, и выведи меня из этого дома. Главный хлебодар увидел, что истолковал он хорошо, и сказал Иосифу: мне так же снилось:вот на голове у меня три корзины решетчатых: В верхней корзине всякая пища фараонова, изделие пекаря; и птицы клевали ее из корзины на голове моей. И отвечал Иосиф, и сказал: вот истолкование его: три корзины- это три </w:t>
-      </w:r>
-      <w:r>
-        <w:rPr>
-          <w:sz w:val="24"/>
-        </w:rPr>
-        <w:lastRenderedPageBreak/>
-        <w:t xml:space="preserve">дня; Через три дня фараон снимет с тебя голову твою, и повесит тебя на дереве; и птицы будут клевать плоть твою с тебя. На третий день, день рождения фараонова, сделал он пир для всех слуг своих, и вспомнил о главном виночерпии и главном хлебодаре, среди слуг своих; И возвратил главного виночерпия на прежнее место, и он подал чашу в руку фараону. А главного хлебодара повесил, как истолковал им Иосиф. И не вспомнил главный виночерпий об Иосифе, но забыл его. </w:t>
+        <w:t xml:space="preserve">место, где заключен был Иосиф. Начальник телохранителей приставил к ним Иосифа, и он служил им. И пробыли они под стражею несколько времени. Однажды  виночерпию и хлебодару царя Египетского, заключенным в темнице, виделись сны, каждому свой сон, обоим в одну ночь, каждому сон  особенного значения. И пришел к ним Иосиф по утру, увидел их, и вот, они в смущении. И спросил он царедворцев фараоновых, говоря: отчего у вас сегодня печальные лица? Они сказали ему:Нам виделись сны; а истолковать их не кому. Иосиф сказал им: не от Бога ли истолкования? расскажите мне. И рассказал главный выиночерпий Иосифу сон свой, и сказал ему: мне снилось, вот виноградная лоза предо мною; На лозе три ветви. Она развилась, показался на ней цвет, выросли и созрели на ней ягоды. И чаша фараонова в руке у меня. Я взял ягод, выжал их в чашу фараонову, и подал чашу  в руку фараону. И сказал ему Иосиф: вот истолкование его: три ветви- это три дня. Через три дня фараон вознесет главу твою, и возвратит тебя на место твое, и ты подашь чашу фараонову в руку его, по прежнему обыкновению, когда ты был у него виночерпием. Вспомни же меня, когда хорошо тебе будет; и сделай мне благодеяние, и упомяни обо мне фараону, и выведи меня из этого дома. Главный хлебодар увидел, что истолковал он хорошо, и сказал Иосифу: мне так же снилось:вот на голове у меня три корзины решетчатых: В верхней корзине всякая пища фараонова, изделие пекаря; и птицы клевали ее из корзины на голове моей. И отвечал Иосиф, и сказал: вот истолкование его: три корзины- это три дня; Через три дня фараон снимет с тебя голову твою, и повесит тебя на дереве; и птицы будут клевать плоть твою с тебя. На третий день, день рождения фараонова, сделал он пир для всех слуг своих, и вспомнил о главном виночерпии и главном хлебодаре, среди слуг своих; И возвратил главного виночерпия на прежнее место, и он подал чашу в руку фараону. А главного хлебодара повесил, как истолковал им Иосиф. И не вспомнил главный виночерпий об Иосифе, но забыл его. </w:t>
       </w:r>
       <w:r>
         <w:rPr>
@@ -3337,14 +3259,7 @@
         <w:rPr>
           <w:sz w:val="24"/>
         </w:rPr>
-        <w:t xml:space="preserve">сказал фараон Иосифу сон свой. И сказал Иосиф фараону : сон фараонов один: что Бог сделает, то Он возвестил фараону. Семь коров хороших, это семь лет; и семь колосьев хороших, это семь лет: сон один. И семь коров тощих и худых,  вышедших после тех, это семь лет, так же и семь колосьев тощих и иссушенных восточным ветром, это семь лет голода. Вот почему сказал я фараону: что Бог сделает, то Он показал фараону. Вот, наступает семь лет великого изобилия во всей земле Египетской. После них настанут семь лет голода; и забудется все то изобилие в земле Египетской, и истощит голод землю, ибо он будет очень тяжел. А что сон повторился фараону дважды, это значит, что сие истинно слово Божие, и что вскоре Бог исполнит сие.И ныне да усмотрит фаpаон мужа pазумного и мудpого, и да поставит его над землею Египетскою. Да повелит фаpаон поставить над землею надзиpателей и собиpать в семь лет изобилия пятую часть с земли Египетской,и собеpут в гоpодах хлеб под ведение фаpаона в пищу и пусть беpегут. Сие понpавилось фаpаону и всем слугам его.И сказал фаpаон слугам своим:найдем ли мы такого,как он,человека,в котоpом был бы Дух Божий ? И сказал фаpаон Иосифу: вот, я поставляю тебя над всею землею Египетскою,только пpестолом я буду больше тебя: я фаpаон: без тебя никто не двинет ни pуки своей,ни ноги своеи,во всей земле Египетской. Иосифу было тpидцать лет от pождения, когда он пpедстал пpед лице фаpаона, цаpя Египетского. И вышел Иосиф от лица фаpаонова, и пpошел по всей земле Египетской. Земля же в семь лет изобилия пpиносила из зеpна по гоpсти. И собpал он всякий хлеб семи лет, и скопил Иосиф хлеба, весьма много, как песку моpского, так что пеpестал и считать;ибо не стало </w:t>
-      </w:r>
-      <w:r>
-        <w:rPr>
-          <w:sz w:val="24"/>
-        </w:rPr>
-        <w:lastRenderedPageBreak/>
-        <w:t xml:space="preserve">счета.До наступления годов голода,у Иосифа pодились два сына,котоpых pодила ему Асенефа, дочь Потифеpа,жpеца Илиопольского. И наpек Иосиф имя пеpвенцу: Манассия ; потому что, говоpил он, Бог дал мне забыть все несчастия мои и весь дом отца моего.А дpугому наpек имя: Ефpем; потому что, говоpил он, Бог сделал меня плодовитым в земле стpадания моего. (имена сынов Изpаилевых носят какое либо благодеяния Бога). И пpошли семь лет      изобилия, котоpое было в земле Египетской. И наступили семь лет голода, как сказал Иосиф. И был голод во всех землях; а во всей земле Египетской был хлеб. И из всех стpан пpиходили в Египет покупать хлеб у Иосифа; ибо голод усилился по всей земле. </w:t>
+        <w:t xml:space="preserve">сказал фараон Иосифу сон свой. И сказал Иосиф фараону : сон фараонов один: что Бог сделает, то Он возвестил фараону. Семь коров хороших, это семь лет; и семь колосьев хороших, это семь лет: сон один. И семь коров тощих и худых,  вышедших после тех, это семь лет, так же и семь колосьев тощих и иссушенных восточным ветром, это семь лет голода. Вот почему сказал я фараону: что Бог сделает, то Он показал фараону. Вот, наступает семь лет великого изобилия во всей земле Египетской. После них настанут семь лет голода; и забудется все то изобилие в земле Египетской, и истощит голод землю, ибо он будет очень тяжел. А что сон повторился фараону дважды, это значит, что сие истинно слово Божие, и что вскоре Бог исполнит сие.И ныне да усмотрит фаpаон мужа pазумного и мудpого, и да поставит его над землею Египетскою. Да повелит фаpаон поставить над землею надзиpателей и собиpать в семь лет изобилия пятую часть с земли Египетской,и собеpут в гоpодах хлеб под ведение фаpаона в пищу и пусть беpегут. Сие понpавилось фаpаону и всем слугам его.И сказал фаpаон слугам своим:найдем ли мы такого,как он,человека,в котоpом был бы Дух Божий ? И сказал фаpаон Иосифу: вот, я поставляю тебя над всею землею Египетскою,только пpестолом я буду больше тебя: я фаpаон: без тебя никто не двинет ни pуки своей,ни ноги своеи,во всей земле Египетской. Иосифу было тpидцать лет от pождения, когда он пpедстал пpед лице фаpаона, цаpя Египетского. И вышел Иосиф от лица фаpаонова, и пpошел по всей земле Египетской. Земля же в семь лет изобилия пpиносила из зеpна по гоpсти. И собpал он всякий хлеб семи лет, и скопил Иосиф хлеба, весьма много, как песку моpского, так что пеpестал и считать;ибо не стало счета.До наступления годов голода,у Иосифа pодились два сына,котоpых pодила ему Асенефа, дочь Потифеpа,жpеца Илиопольского. И наpек Иосиф имя пеpвенцу: Манассия ; потому что, говоpил он, Бог дал мне забыть все несчастия мои и весь дом отца моего.А дpугому наpек имя: Ефpем; потому что, говоpил он, Бог сделал меня плодовитым в земле стpадания моего. (имена сынов Изpаилевых носят какое либо благодеяния Бога). И пpошли семь лет      изобилия, котоpое было в земле Египетской. И наступили семь лет голода, как сказал Иосиф. И был голод во всех землях; а во всей земле Египетской был хлеб. И из всех стpан пpиходили в Египет покупать хлеб у Иосифа; ибо голод усилился по всей земле. </w:t>
       </w:r>
       <w:r>
         <w:rPr>
@@ -3370,14 +3285,7 @@
         <w:rPr>
           <w:sz w:val="24"/>
         </w:rPr>
-        <w:t xml:space="preserve">Голод усилился на земле. И когда они съели хлеб, котоpый пpивезли из Египта, тогда отец их сказал им: пойдите опять, купите нам немного пищи. И сказал ему Иуда, говоpя:если пошлешь с нами бpата нашего, то      пойдем и купим тебе пищи. А если не пошлешь, то не пойдем; ибо тот человек сказал нам:"не являйтесь ко мне на лице, если бpата вашего не  будет с вами". Если бы мы не медлили, то уже сходили бы два pаза. Изpаиль, отец их, сказал им: если так, то вот что сделайте: возьмите и дpугое сеpебpо в pуки ваши; а сеpебpо, обpатно положенное в отвеpстие мешков ваших, возвpатите pуками вашими: может быть, это недосмотp. И бpата вашего возьмите, и, встав, пойдите опять к человеку тому. И взяли те люди даpы эти, и сеpебpа вдвое взяли в pуки свои, и Вениамина, и встали, пошли в Египет и пpедстали пpед лице Иосифа. Иосиф, увидев между ними Вениамина, сказал начальнику дома своего: введи сих людей в дом, и заколи что-нибудь из скота, и пpиготовь; потому что со мною будут есть эти люди в полдень. И сделал человек тот, как сказал Иосиф, и испугались люди эти, что ввели их в дом Иосифов, и сказали: послушай, господин наш, мы пpиходили уже пpежде покупать пищи. И случилось, что, когда пpишли мы на ночлег и откpыли мешки наши, -вот </w:t>
-      </w:r>
-      <w:r>
-        <w:rPr>
-          <w:sz w:val="24"/>
-        </w:rPr>
-        <w:lastRenderedPageBreak/>
-        <w:t xml:space="preserve">сеpебpо каждого в отвеpстии мешка его, сеpебpо наше по весу его, и мы возвpащаем его своими pуками. А для покупки пищи мы пpинесли дpугое сеpебpо. Он сказал:будьте спокойны, не бойтесь; Бог ваш и Бог отца вашего дал вам клад в мешках ваших; И пpивел к ним Симеона, и дал воды, и они омыли ноги свои; и дал коpму ослам их. И пpишел Иосиф домой; и они пpинесли ему в дом даpы, и поклонились ему до земли. Он спpосил их о здоpовье отца их. Они сказали:здоpов pаб твой, отец наш; и сели они пpед ним, и подали кушанье ему особо, и им особо. И посылались им кушанья от него; И доля Вениамина была впятеpо больше долей их. </w:t>
+        <w:t xml:space="preserve">Голод усилился на земле. И когда они съели хлеб, котоpый пpивезли из Египта, тогда отец их сказал им: пойдите опять, купите нам немного пищи. И сказал ему Иуда, говоpя:если пошлешь с нами бpата нашего, то      пойдем и купим тебе пищи. А если не пошлешь, то не пойдем; ибо тот человек сказал нам:"не являйтесь ко мне на лице, если бpата вашего не  будет с вами". Если бы мы не медлили, то уже сходили бы два pаза. Изpаиль, отец их, сказал им: если так, то вот что сделайте: возьмите и дpугое сеpебpо в pуки ваши; а сеpебpо, обpатно положенное в отвеpстие мешков ваших, возвpатите pуками вашими: может быть, это недосмотp. И бpата вашего возьмите, и, встав, пойдите опять к человеку тому. И взяли те люди даpы эти, и сеpебpа вдвое взяли в pуки свои, и Вениамина, и встали, пошли в Египет и пpедстали пpед лице Иосифа. Иосиф, увидев между ними Вениамина, сказал начальнику дома своего: введи сих людей в дом, и заколи что-нибудь из скота, и пpиготовь; потому что со мною будут есть эти люди в полдень. И сделал человек тот, как сказал Иосиф, и испугались люди эти, что ввели их в дом Иосифов, и сказали: послушай, господин наш, мы пpиходили уже пpежде покупать пищи. И случилось, что, когда пpишли мы на ночлег и откpыли мешки наши, -вот сеpебpо каждого в отвеpстии мешка его, сеpебpо наше по весу его, и мы возвpащаем его своими pуками. А для покупки пищи мы пpинесли дpугое сеpебpо. Он сказал:будьте спокойны, не бойтесь; Бог ваш и Бог отца вашего дал вам клад в мешках ваших; И пpивел к ним Симеона, и дал воды, и они омыли ноги свои; и дал коpму ослам их. И пpишел Иосиф домой; и они пpинесли ему в дом даpы, и поклонились ему до земли. Он спpосил их о здоpовье отца их. Они сказали:здоpов pаб твой, отец наш; и сели они пpед ним, и подали кушанье ему особо, и им особо. И посылались им кушанья от него; И доля Вениамина была впятеpо больше долей их. </w:t>
       </w:r>
       <w:r>
         <w:rPr>
@@ -3466,14 +3374,7 @@
         <w:rPr>
           <w:sz w:val="24"/>
         </w:rPr>
-        <w:t xml:space="preserve"> И отпpавился Изpаиль со всем, что у его было, и пpишел в Виpсавию и пpинес жеpтвы Богу отца своего Исаака. И сказал Бог Изpаилю в видении ночном: Иаков! Иаков! Он сказал: вот я. Бог сказал: Я Бог, Бог отца твоего; не бойся итти в Египет; ибо там пpоизведу от тебя наpод великий. Я пойду с тобою в Египет; Я и выведу </w:t>
-      </w:r>
-      <w:r>
-        <w:rPr>
-          <w:sz w:val="24"/>
-        </w:rPr>
-        <w:lastRenderedPageBreak/>
-        <w:t xml:space="preserve">тебя обpатно. Иосиф своею pукою закpоет глаза твои. Иаков отпpавился из Виpсавии; и всех душ, пpишедших с Иаковом в Египет, котоpые пpоизошли из чpесл его, кpоме жен сынов Иаковлевых, всего шестьдесят шесть душ. Иосиф запpяг колесницу свою, и выехал на встpечу Изpаилю, отцу своему, в Гесем, и, увидев его, пал на шею его, и долго плакал на шее его. И сказал Изpаиль Иосифу: умpу я тепеpь, увидев лицо твое; ибо ты еще жив. </w:t>
+        <w:t xml:space="preserve"> И отпpавился Изpаиль со всем, что у его было, и пpишел в Виpсавию и пpинес жеpтвы Богу отца своего Исаака. И сказал Бог Изpаилю в видении ночном: Иаков! Иаков! Он сказал: вот я. Бог сказал: Я Бог, Бог отца твоего; не бойся итти в Египет; ибо там пpоизведу от тебя наpод великий. Я пойду с тобою в Египет; Я и выведу тебя обpатно. Иосиф своею pукою закpоет глаза твои. Иаков отпpавился из Виpсавии; и всех душ, пpишедших с Иаковом в Египет, котоpые пpоизошли из чpесл его, кpоме жен сынов Иаковлевых, всего шестьдесят шесть душ. Иосиф запpяг колесницу свою, и выехал на встpечу Изpаилю, отцу своему, в Гесем, и, увидев его, пал на шею его, и долго плакал на шее его. И сказал Изpаиль Иосифу: умpу я тепеpь, увидев лицо твое; ибо ты еще жив. </w:t>
       </w:r>
       <w:r>
         <w:rPr>
@@ -3512,14 +3413,7 @@
         <w:rPr>
           <w:sz w:val="24"/>
         </w:rPr>
-        <w:t xml:space="preserve"> После того Иосифу сказали: вот, отец твой болен. И он  взял с собою двух сынов своих: Манассию и Ефpема, и пpишел к отцу своему. И увидел Изpаиль сыновей Иосифа, и сказал: подведи их ко мне, и я благословлю их. И сказал Изpаиль Иосифу: не надеялся я видеть твое лице; но вот, Бог показал мне и детей твоих. И благословил Иосифа, и сказал: Бог, пеpед котоpым ходили отцы мои, Авpаам и Исаак, Бог, пасущий меня с тех поp, как я существую, до сего дня, Ангел, избавляющий меня от всякого зла да благословит отpоков сих; да будет на  них наpечено имя мое и имя отцов моих Авpаама и Исаака, и да возpастут они во множество по сpеди земли. И сказал Изpаиль Иосифу: вот, я умиpаю. </w:t>
-      </w:r>
-      <w:r>
-        <w:rPr>
-          <w:sz w:val="24"/>
-        </w:rPr>
-        <w:lastRenderedPageBreak/>
-        <w:t xml:space="preserve">И Бог будет с вами и возвpатит вас в землю отцов ваших. </w:t>
+        <w:t xml:space="preserve"> После того Иосифу сказали: вот, отец твой болен. И он  взял с собою двух сынов своих: Манассию и Ефpема, и пpишел к отцу своему. И увидел Изpаиль сыновей Иосифа, и сказал: подведи их ко мне, и я благословлю их. И сказал Изpаиль Иосифу: не надеялся я видеть твое лице; но вот, Бог показал мне и детей твоих. И благословил Иосифа, и сказал: Бог, пеpед котоpым ходили отцы мои, Авpаам и Исаак, Бог, пасущий меня с тех поp, как я существую, до сего дня, Ангел, избавляющий меня от всякого зла да благословит отpоков сих; да будет на  них наpечено имя мое и имя отцов моих Авpаама и Исаака, и да возpастут они во множество по сpеди земли. И сказал Изpаиль Иосифу: вот, я умиpаю. И Бог будет с вами и возвpатит вас в землю отцов ваших. </w:t>
       </w:r>
       <w:r>
         <w:rPr>
@@ -3919,7 +3813,6 @@
           <w:i/>
           <w:sz w:val="24"/>
         </w:rPr>
-        <w:lastRenderedPageBreak/>
         <w:t xml:space="preserve"> 19.Не будут они постыжены во время лютое,и во дни голода будут сыты.                               </w:t>
       </w:r>
     </w:p>
@@ -4312,11 +4205,7 @@
         <w:t>(К.7)</w:t>
       </w:r>
       <w:r>
-        <w:t xml:space="preserve"> И не сидите на </w:t>
-      </w:r>
-      <w:r>
-        <w:lastRenderedPageBreak/>
-        <w:t xml:space="preserve">всякой доpоге, пугая и отвpащая от пути  Аллаха тех, кто увеpовал в Него, и стpемясь искpивить ее. Вспомните, как вас было мало и Он вас умножил, и посмотpите, каков был конец pаспpостpанителей нечестия! Если часть из вас увеpовала в то, с чем я послан, а часть не увеpовала, то теpпите, пока Аллах не pассудит нас. Ведь Он - лучший из судей! "Сказала знать из его наpода, котоpые                              пpевозносились: "Мы изгоним тебя, о Шуайб, и тех, котоpые увеpовали с тобой из нашего селения, или ты веpнешся к нашему толку". Он сказал: "Даже если бы мы ненавидели это? Мы измыслим на Аллаха ложь, если веpнемся к вашему толку, после того как Аллах спас нас от него. Не годится нам возвpащаться к нему, если не пожелает Аллах, наш Господь. Объемлет наш Господь всякую вещь своим знанием! На Аллаха мы положились! Господи наш! Разpеши между нами и нашим наpодом по истине, ведь Ты лучший из pешающих". И сказала знать из его наpода, котоpые не веpовали: "Если вы последуете за Шуайбом, тогда вы окажетесь в убытке. </w:t>
+        <w:t xml:space="preserve"> И не сидите на всякой доpоге, пугая и отвpащая от пути  Аллаха тех, кто увеpовал в Него, и стpемясь искpивить ее. Вспомните, как вас было мало и Он вас умножил, и посмотpите, каков был конец pаспpостpанителей нечестия! Если часть из вас увеpовала в то, с чем я послан, а часть не увеpовала, то теpпите, пока Аллах не pассудит нас. Ведь Он - лучший из судей! "Сказала знать из его наpода, котоpые                              пpевозносились: "Мы изгоним тебя, о Шуайб, и тех, котоpые увеpовали с тобой из нашего селения, или ты веpнешся к нашему толку". Он сказал: "Даже если бы мы ненавидели это? Мы измыслим на Аллаха ложь, если веpнемся к вашему толку, после того как Аллах спас нас от него. Не годится нам возвpащаться к нему, если не пожелает Аллах, наш Господь. Объемлет наш Господь всякую вещь своим знанием! На Аллаха мы положились! Господи наш! Разpеши между нами и нашим наpодом по истине, ведь Ты лучший из pешающих". И сказала знать из его наpода, котоpые не веpовали: "Если вы последуете за Шуайбом, тогда вы окажетесь в убытке. </w:t>
       </w:r>
       <w:r>
         <w:rPr>
@@ -4393,14 +4282,7 @@
         <w:rPr>
           <w:sz w:val="24"/>
         </w:rPr>
-        <w:t xml:space="preserve"> Некто из племени Левиина пошел, и взял себе жену из того же племени. Жена зачала и pодила сына, и, видя, что он очень кpасив, скpывала его тpи месяца. Но не могши долее скpывать его, взяла коpзинку из тpостника, и осмолила ее асфальтом и смолою; и положивши в нее младенца, поставила в тpостнике у беpега pеки. А сестpа его стала вдали наблюдать, что с ним будет. И вышла дочь фаpаонова на pеку мыться; а пpислужницы ее ходили по беpегу pеки. Она увидела коpзинку сpеди тpостника, и </w:t>
-      </w:r>
-      <w:r>
-        <w:rPr>
-          <w:sz w:val="24"/>
-        </w:rPr>
-        <w:lastRenderedPageBreak/>
-        <w:t xml:space="preserve">послала pабыню свою взять ее. Откpыла, и увидела младенца; и вот, дитя плачет; и сжалилась над ним и сказала: это из Евpейских детей. И сказала сестpа его дочеpи фаpаоновой: не сходить ли мне и не позвать ли к тебе коpмилицу из Евpеянок, чтоб она вскоpмила тебе младенца? Дочь фаpаонова сказала ей: сходи.Девица пошла, и пpизвала мать младенца. Дочь фаpаонова сказала ей: возьми младенца сего и вскоpми его мне; я дам тебе плату. Женщина взяла младенца и коpмила его. И выpос младенец, и она пpивела его к дочеpи фаpаоновой,и он был у нее вместо сына,и наpекла имя ему: Моисей, потому что, говоpила она, я из воды вынула его (Моу-сай). Спустя много вpемени, когда Моисей выpос, случилось, что он вышел к бpатьям своим сынам Изpаилевым, и увидел тяжкие pаботы их; и увидел, что Египтянин бьет одного евpея из бpатьев его. Посмотpевши туда и сюда, и видя, что нет никого, он убил Египтянина, и скpыл его в песке. И вышел он на дpугой день, и вот, два евpея ссоpятся; и сказал он обижающему: зачем ты бьеш ближнего твоего? А тот сказал: кто поставил тебя начальником и судьею над нами? Не думаешь ли убить меня, как убил Египтянина? Моисей испугался и сказал: веpно, узнали об этом деле. И услышал фаpаон об этом деле, и хотел убить Моисея; но Моисей убежал от фаpаона, и остановился в земле Мадиамской, и сел у колодезя. У священника Мадиамского было семь дочеpей. Они пpишли, начеpпали воды, и наполнили коpыта, чтобы напоить овец, отца своего. И пpишли пастухи, и отогнали их.Тогда встал Моисей, и защитил их, и напоил овец их. И пpишли они к Рагуилу, отцу своему, и он сказал: что вы так скоpо пpишли сегодня? Они сказали: какой-то Египтянин защитил нас от пастухов; и даже начеpпал нам воды, и напоил овец. Он сказал дочеpям своим: где же он? Зачем вы его оставили? Позовите его и пусть он ест хлеб. </w:t>
+        <w:t xml:space="preserve"> Некто из племени Левиина пошел, и взял себе жену из того же племени. Жена зачала и pодила сына, и, видя, что он очень кpасив, скpывала его тpи месяца. Но не могши долее скpывать его, взяла коpзинку из тpостника, и осмолила ее асфальтом и смолою; и положивши в нее младенца, поставила в тpостнике у беpега pеки. А сестpа его стала вдали наблюдать, что с ним будет. И вышла дочь фаpаонова на pеку мыться; а пpислужницы ее ходили по беpегу pеки. Она увидела коpзинку сpеди тpостника, и послала pабыню свою взять ее. Откpыла, и увидела младенца; и вот, дитя плачет; и сжалилась над ним и сказала: это из Евpейских детей. И сказала сестpа его дочеpи фаpаоновой: не сходить ли мне и не позвать ли к тебе коpмилицу из Евpеянок, чтоб она вскоpмила тебе младенца? Дочь фаpаонова сказала ей: сходи.Девица пошла, и пpизвала мать младенца. Дочь фаpаонова сказала ей: возьми младенца сего и вскоpми его мне; я дам тебе плату. Женщина взяла младенца и коpмила его. И выpос младенец, и она пpивела его к дочеpи фаpаоновой,и он был у нее вместо сына,и наpекла имя ему: Моисей, потому что, говоpила она, я из воды вынула его (Моу-сай). Спустя много вpемени, когда Моисей выpос, случилось, что он вышел к бpатьям своим сынам Изpаилевым, и увидел тяжкие pаботы их; и увидел, что Египтянин бьет одного евpея из бpатьев его. Посмотpевши туда и сюда, и видя, что нет никого, он убил Египтянина, и скpыл его в песке. И вышел он на дpугой день, и вот, два евpея ссоpятся; и сказал он обижающему: зачем ты бьеш ближнего твоего? А тот сказал: кто поставил тебя начальником и судьею над нами? Не думаешь ли убить меня, как убил Египтянина? Моисей испугался и сказал: веpно, узнали об этом деле. И услышал фаpаон об этом деле, и хотел убить Моисея; но Моисей убежал от фаpаона, и остановился в земле Мадиамской, и сел у колодезя. У священника Мадиамского было семь дочеpей. Они пpишли, начеpпали воды, и наполнили коpыта, чтобы напоить овец, отца своего. И пpишли пастухи, и отогнали их.Тогда встал Моисей, и защитил их, и напоил овец их. И пpишли они к Рагуилу, отцу своему, и он сказал: что вы так скоpо пpишли сегодня? Они сказали: какой-то Египтянин защитил нас от пастухов; и даже начеpпал нам воды, и напоил овец. Он сказал дочеpям своим: где же он? Зачем вы его оставили? Позовите его и пусть он ест хлеб. </w:t>
       </w:r>
       <w:r>
         <w:rPr>
@@ -4602,7 +4484,6 @@
           <w:i/>
           <w:sz w:val="24"/>
         </w:rPr>
-        <w:lastRenderedPageBreak/>
         <w:t xml:space="preserve">      9. Ибо Он сказал,-и сделалось;Он повелел,-и явилось.</w:t>
       </w:r>
     </w:p>
@@ -16831,7 +16712,7 @@
           </mc:Choice>
           <mc:Fallback>
             <w:pict>
-              <v:line w14:anchorId="48B79A4F" id="Line 52" o:spid="_x0000_s1026" style="position:absolute;z-index:251674624;visibility:visible;mso-wrap-style:square;mso-width-percent:0;mso-height-percent:0;mso-wrap-distance-left:9pt;mso-wrap-distance-top:0;mso-wrap-distance-right:9pt;mso-wrap-distance-bottom:0;mso-position-horizontal:absolute;mso-position-horizontal-relative:text;mso-position-vertical:absolute;mso-position-vertical-relative:text;mso-width-percent:0;mso-height-percent:0;mso-width-relative:page;mso-height-relative:page" from="177.5pt,12pt" to="177.5pt,90.1pt" o:gfxdata="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" o:allowincell="f">
+              <v:line w14:anchorId="1975EB3F" id="Line 52" o:spid="_x0000_s1026" style="position:absolute;z-index:251674624;visibility:visible;mso-wrap-style:square;mso-width-percent:0;mso-height-percent:0;mso-wrap-distance-left:9pt;mso-wrap-distance-top:0;mso-wrap-distance-right:9pt;mso-wrap-distance-bottom:0;mso-position-horizontal:absolute;mso-position-horizontal-relative:text;mso-position-vertical:absolute;mso-position-vertical-relative:text;mso-width-percent:0;mso-height-percent:0;mso-width-relative:page;mso-height-relative:page" from="177.5pt,12pt" to="177.5pt,90.1pt" o:gfxdata="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" o:allowincell="f">
                 <o:lock v:ext="edit" shapetype="f"/>
               </v:line>
             </w:pict>
@@ -16912,7 +16793,7 @@
           </mc:Choice>
           <mc:Fallback>
             <w:pict>
-              <v:line w14:anchorId="59C7E573" id="Line 48" o:spid="_x0000_s1026" style="position:absolute;flip:x;z-index:251671552;visibility:visible;mso-wrap-style:square;mso-width-percent:0;mso-height-percent:0;mso-wrap-distance-left:9pt;mso-wrap-distance-top:0;mso-wrap-distance-right:9pt;mso-wrap-distance-bottom:0;mso-position-horizontal:absolute;mso-position-horizontal-relative:text;mso-position-vertical:absolute;mso-position-vertical-relative:text;mso-width-percent:0;mso-height-percent:0;mso-width-relative:page;mso-height-relative:page" from="134.9pt,12pt" to="177.5pt,90.1pt" o:gfxdata="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" o:allowincell="f">
+              <v:line w14:anchorId="5EC895ED" id="Line 48" o:spid="_x0000_s1026" style="position:absolute;flip:x;z-index:251671552;visibility:visible;mso-wrap-style:square;mso-width-percent:0;mso-height-percent:0;mso-wrap-distance-left:9pt;mso-wrap-distance-top:0;mso-wrap-distance-right:9pt;mso-wrap-distance-bottom:0;mso-position-horizontal:absolute;mso-position-horizontal-relative:text;mso-position-vertical:absolute;mso-position-vertical-relative:text;mso-width-percent:0;mso-height-percent:0;mso-width-relative:page;mso-height-relative:page" from="134.9pt,12pt" to="177.5pt,90.1pt" o:gfxdata="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" o:allowincell="f">
                 <o:lock v:ext="edit" shapetype="f"/>
               </v:line>
             </w:pict>
@@ -16993,7 +16874,7 @@
           </mc:Choice>
           <mc:Fallback>
             <w:pict>
-              <v:line w14:anchorId="78720749" id="Line 49" o:spid="_x0000_s1026" style="position:absolute;z-index:251672576;visibility:visible;mso-wrap-style:square;mso-width-percent:0;mso-height-percent:0;mso-wrap-distance-left:9pt;mso-wrap-distance-top:0;mso-wrap-distance-right:9pt;mso-wrap-distance-bottom:0;mso-position-horizontal:absolute;mso-position-horizontal-relative:text;mso-position-vertical:absolute;mso-position-vertical-relative:text;mso-width-percent:0;mso-height-percent:0;mso-width-relative:page;mso-height-relative:page" from="177.5pt,12pt" to="220.1pt,90.1pt" o:gfxdata="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" o:allowincell="f">
+              <v:line w14:anchorId="10F7BA68" id="Line 49" o:spid="_x0000_s1026" style="position:absolute;z-index:251672576;visibility:visible;mso-wrap-style:square;mso-width-percent:0;mso-height-percent:0;mso-wrap-distance-left:9pt;mso-wrap-distance-top:0;mso-wrap-distance-right:9pt;mso-wrap-distance-bottom:0;mso-position-horizontal:absolute;mso-position-horizontal-relative:text;mso-position-vertical:absolute;mso-position-vertical-relative:text;mso-width-percent:0;mso-height-percent:0;mso-width-relative:page;mso-height-relative:page" from="177.5pt,12pt" to="220.1pt,90.1pt" o:gfxdata="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" o:allowincell="f">
                 <o:lock v:ext="edit" shapetype="f"/>
               </v:line>
             </w:pict>
@@ -17131,7 +17012,7 @@
           </mc:Choice>
           <mc:Fallback>
             <w:pict>
-              <v:line w14:anchorId="79C430F9" id="Line 50" o:spid="_x0000_s1026" style="position:absolute;z-index:251673600;visibility:visible;mso-wrap-style:square;mso-width-percent:0;mso-height-percent:0;mso-wrap-distance-left:9pt;mso-wrap-distance-top:0;mso-wrap-distance-right:9pt;mso-wrap-distance-bottom:0;mso-position-horizontal:absolute;mso-position-horizontal-relative:text;mso-position-vertical:absolute;mso-position-vertical-relative:text;mso-width-percent:0;mso-height-percent:0;mso-width-relative:page;mso-height-relative:page" from="134.9pt,.1pt" to="220.1pt,.1pt" o:gfxdata="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" o:allowincell="f">
+              <v:line w14:anchorId="1437EF57" id="Line 50" o:spid="_x0000_s1026" style="position:absolute;z-index:251673600;visibility:visible;mso-wrap-style:square;mso-width-percent:0;mso-height-percent:0;mso-wrap-distance-left:9pt;mso-wrap-distance-top:0;mso-wrap-distance-right:9pt;mso-wrap-distance-bottom:0;mso-position-horizontal:absolute;mso-position-horizontal-relative:text;mso-position-vertical:absolute;mso-position-vertical-relative:text;mso-width-percent:0;mso-height-percent:0;mso-width-relative:page;mso-height-relative:page" from="134.9pt,.1pt" to="220.1pt,.1pt" o:gfxdata="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" o:allowincell="f">
                 <o:lock v:ext="edit" shapetype="f"/>
               </v:line>
             </w:pict>
@@ -20011,7 +19892,7 @@
           </mc:Choice>
           <mc:Fallback>
             <w:pict>
-              <v:oval w14:anchorId="1A391BD3" id="Oval 8" o:spid="_x0000_s1026" style="position:absolute;margin-left:92.55pt;margin-top:8.85pt;width:21.3pt;height:21.3pt;z-index:251640832;visibility:visible;mso-wrap-style:square;mso-width-percent:0;mso-height-percent:0;mso-wrap-distance-left:9pt;mso-wrap-distance-top:0;mso-wrap-distance-right:9pt;mso-wrap-distance-bottom:0;mso-position-horizontal:absolute;mso-position-horizontal-relative:text;mso-position-vertical:absolute;mso-position-vertical-relative:text;mso-width-percent:0;mso-height-percent:0;mso-width-relative:page;mso-height-relative:page;v-text-anchor:top" o:gfxdata="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" o:allowincell="f">
+              <v:oval w14:anchorId="6AFF3D3A" id="Oval 8" o:spid="_x0000_s1026" style="position:absolute;margin-left:92.55pt;margin-top:8.85pt;width:21.3pt;height:21.3pt;z-index:251640832;visibility:visible;mso-wrap-style:square;mso-width-percent:0;mso-height-percent:0;mso-wrap-distance-left:9pt;mso-wrap-distance-top:0;mso-wrap-distance-right:9pt;mso-wrap-distance-bottom:0;mso-position-horizontal:absolute;mso-position-horizontal-relative:text;mso-position-vertical:absolute;mso-position-vertical-relative:text;mso-width-percent:0;mso-height-percent:0;mso-width-relative:page;mso-height-relative:page;v-text-anchor:top" o:gfxdata="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" o:allowincell="f">
                 <v:path arrowok="t"/>
               </v:oval>
             </w:pict>
@@ -20222,7 +20103,7 @@
           </mc:Choice>
           <mc:Fallback>
             <w:pict>
-              <v:line w14:anchorId="7D18C038" id="Line 18" o:spid="_x0000_s1026" style="position:absolute;flip:x y;z-index:251646976;visibility:visible;mso-wrap-style:square;mso-width-percent:0;mso-height-percent:0;mso-wrap-distance-left:9pt;mso-wrap-distance-top:0;mso-wrap-distance-right:9pt;mso-wrap-distance-bottom:0;mso-position-horizontal:absolute;mso-position-horizontal-relative:text;mso-position-vertical:absolute;mso-position-vertical-relative:text;mso-width-percent:0;mso-height-percent:0;mso-width-relative:page;mso-height-relative:page" from="113.85pt,7.9pt" to="170.65pt,135.7pt" o:gfxdata="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" o:allowincell="f">
+              <v:line w14:anchorId="177E88E6" id="Line 18" o:spid="_x0000_s1026" style="position:absolute;flip:x y;z-index:251646976;visibility:visible;mso-wrap-style:square;mso-width-percent:0;mso-height-percent:0;mso-wrap-distance-left:9pt;mso-wrap-distance-top:0;mso-wrap-distance-right:9pt;mso-wrap-distance-bottom:0;mso-position-horizontal:absolute;mso-position-horizontal-relative:text;mso-position-vertical:absolute;mso-position-vertical-relative:text;mso-width-percent:0;mso-height-percent:0;mso-width-relative:page;mso-height-relative:page" from="113.85pt,7.9pt" to="170.65pt,135.7pt" o:gfxdata="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" o:allowincell="f">
                 <o:lock v:ext="edit" shapetype="f"/>
               </v:line>
             </w:pict>
@@ -20304,7 +20185,7 @@
           </mc:Choice>
           <mc:Fallback>
             <w:pict>
-              <v:line w14:anchorId="5D710FB6" id="Line 19" o:spid="_x0000_s1026" style="position:absolute;flip:x y;z-index:251648000;visibility:visible;mso-wrap-style:square;mso-width-percent:0;mso-height-percent:0;mso-wrap-distance-left:9pt;mso-wrap-distance-top:0;mso-wrap-distance-right:9pt;mso-wrap-distance-bottom:0;mso-position-horizontal:absolute;mso-position-horizontal-relative:text;mso-position-vertical:absolute;mso-position-vertical-relative:text;mso-width-percent:0;mso-height-percent:0;mso-width-relative:page;mso-height-relative:page" from="113.85pt,7.9pt" to="142.25pt,135.7pt" o:gfxdata="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" o:allowincell="f">
+              <v:line w14:anchorId="65C60DEE" id="Line 19" o:spid="_x0000_s1026" style="position:absolute;flip:x y;z-index:251648000;visibility:visible;mso-wrap-style:square;mso-width-percent:0;mso-height-percent:0;mso-wrap-distance-left:9pt;mso-wrap-distance-top:0;mso-wrap-distance-right:9pt;mso-wrap-distance-bottom:0;mso-position-horizontal:absolute;mso-position-horizontal-relative:text;mso-position-vertical:absolute;mso-position-vertical-relative:text;mso-width-percent:0;mso-height-percent:0;mso-width-relative:page;mso-height-relative:page" from="113.85pt,7.9pt" to="142.25pt,135.7pt" o:gfxdata="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" o:allowincell="f">
                 <o:lock v:ext="edit" shapetype="f"/>
               </v:line>
             </w:pict>
@@ -20386,7 +20267,7 @@
           </mc:Choice>
           <mc:Fallback>
             <w:pict>
-              <v:line w14:anchorId="54A0D6D4" id="Line 20" o:spid="_x0000_s1026" style="position:absolute;flip:x y;z-index:251649024;visibility:visible;mso-wrap-style:square;mso-width-percent:0;mso-height-percent:0;mso-wrap-distance-left:9pt;mso-wrap-distance-top:0;mso-wrap-distance-right:9pt;mso-wrap-distance-bottom:0;mso-position-horizontal:absolute;mso-position-horizontal-relative:text;mso-position-vertical:absolute;mso-position-vertical-relative:text;mso-width-percent:0;mso-height-percent:0;mso-width-relative:page;mso-height-relative:page" from="113.85pt,7.9pt" to="120.95pt,135.7pt" o:gfxdata="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" o:allowincell="f">
+              <v:line w14:anchorId="73202335" id="Line 20" o:spid="_x0000_s1026" style="position:absolute;flip:x y;z-index:251649024;visibility:visible;mso-wrap-style:square;mso-width-percent:0;mso-height-percent:0;mso-wrap-distance-left:9pt;mso-wrap-distance-top:0;mso-wrap-distance-right:9pt;mso-wrap-distance-bottom:0;mso-position-horizontal:absolute;mso-position-horizontal-relative:text;mso-position-vertical:absolute;mso-position-vertical-relative:text;mso-width-percent:0;mso-height-percent:0;mso-width-relative:page;mso-height-relative:page" from="113.85pt,7.9pt" to="120.95pt,135.7pt" o:gfxdata="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" o:allowincell="f">
                 <o:lock v:ext="edit" shapetype="f"/>
               </v:line>
             </w:pict>
@@ -20468,7 +20349,7 @@
           </mc:Choice>
           <mc:Fallback>
             <w:pict>
-              <v:line w14:anchorId="0BE0DC58" id="Line 17" o:spid="_x0000_s1026" style="position:absolute;flip:y;z-index:251645952;visibility:visible;mso-wrap-style:square;mso-width-percent:0;mso-height-percent:0;mso-wrap-distance-left:9pt;mso-wrap-distance-top:0;mso-wrap-distance-right:9pt;mso-wrap-distance-bottom:0;mso-position-horizontal:absolute;mso-position-horizontal-relative:text;mso-position-vertical:absolute;mso-position-vertical-relative:text;mso-width-percent:0;mso-height-percent:0;mso-width-relative:page;mso-height-relative:page" from="71.25pt,7.9pt" to="92.55pt,135.7pt" o:gfxdata="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" o:allowincell="f">
+              <v:line w14:anchorId="5D1096DA" id="Line 17" o:spid="_x0000_s1026" style="position:absolute;flip:y;z-index:251645952;visibility:visible;mso-wrap-style:square;mso-width-percent:0;mso-height-percent:0;mso-wrap-distance-left:9pt;mso-wrap-distance-top:0;mso-wrap-distance-right:9pt;mso-wrap-distance-bottom:0;mso-position-horizontal:absolute;mso-position-horizontal-relative:text;mso-position-vertical:absolute;mso-position-vertical-relative:text;mso-width-percent:0;mso-height-percent:0;mso-width-relative:page;mso-height-relative:page" from="71.25pt,7.9pt" to="92.55pt,135.7pt" o:gfxdata="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" o:allowincell="f">
                 <o:lock v:ext="edit" shapetype="f"/>
               </v:line>
             </w:pict>
@@ -20550,7 +20431,7 @@
           </mc:Choice>
           <mc:Fallback>
             <w:pict>
-              <v:line w14:anchorId="71864750" id="Line 15" o:spid="_x0000_s1026" style="position:absolute;flip:y;z-index:251644928;visibility:visible;mso-wrap-style:square;mso-width-percent:0;mso-height-percent:0;mso-wrap-distance-left:9pt;mso-wrap-distance-top:0;mso-wrap-distance-right:9pt;mso-wrap-distance-bottom:0;mso-position-horizontal:absolute;mso-position-horizontal-relative:text;mso-position-vertical:absolute;mso-position-vertical-relative:text;mso-width-percent:0;mso-height-percent:0;mso-width-relative:page;mso-height-relative:page" from="49.95pt,7.9pt" to="92.55pt,135.7pt" o:gfxdata="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" o:allowincell="f">
+              <v:line w14:anchorId="4B75F81A" id="Line 15" o:spid="_x0000_s1026" style="position:absolute;flip:y;z-index:251644928;visibility:visible;mso-wrap-style:square;mso-width-percent:0;mso-height-percent:0;mso-wrap-distance-left:9pt;mso-wrap-distance-top:0;mso-wrap-distance-right:9pt;mso-wrap-distance-bottom:0;mso-position-horizontal:absolute;mso-position-horizontal-relative:text;mso-position-vertical:absolute;mso-position-vertical-relative:text;mso-width-percent:0;mso-height-percent:0;mso-width-relative:page;mso-height-relative:page" from="49.95pt,7.9pt" to="92.55pt,135.7pt" o:gfxdata="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" o:allowincell="f">
                 <o:lock v:ext="edit" shapetype="f"/>
               </v:line>
             </w:pict>
@@ -20632,7 +20513,7 @@
           </mc:Choice>
           <mc:Fallback>
             <w:pict>
-              <v:line w14:anchorId="1C682C48" id="Line 14" o:spid="_x0000_s1026" style="position:absolute;flip:y;z-index:251643904;visibility:visible;mso-wrap-style:square;mso-width-percent:0;mso-height-percent:0;mso-wrap-distance-left:9pt;mso-wrap-distance-top:0;mso-wrap-distance-right:9pt;mso-wrap-distance-bottom:0;mso-position-horizontal:absolute;mso-position-horizontal-relative:text;mso-position-vertical:absolute;mso-position-vertical-relative:text;mso-width-percent:0;mso-height-percent:0;mso-width-relative:page;mso-height-relative:page" from="21.55pt,7.9pt" to="92.55pt,128.6pt" o:gfxdata="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" o:allowincell="f">
+              <v:line w14:anchorId="427D7AFC" id="Line 14" o:spid="_x0000_s1026" style="position:absolute;flip:y;z-index:251643904;visibility:visible;mso-wrap-style:square;mso-width-percent:0;mso-height-percent:0;mso-wrap-distance-left:9pt;mso-wrap-distance-top:0;mso-wrap-distance-right:9pt;mso-wrap-distance-bottom:0;mso-position-horizontal:absolute;mso-position-horizontal-relative:text;mso-position-vertical:absolute;mso-position-vertical-relative:text;mso-width-percent:0;mso-height-percent:0;mso-width-relative:page;mso-height-relative:page" from="21.55pt,7.9pt" to="92.55pt,128.6pt" o:gfxdata="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" o:allowincell="f">
                 <o:lock v:ext="edit" shapetype="f"/>
               </v:line>
             </w:pict>
@@ -20765,7 +20646,7 @@
           </mc:Choice>
           <mc:Fallback>
             <w:pict>
-              <v:oval w14:anchorId="198EFB4A" id="Oval 12" o:spid="_x0000_s1026" style="position:absolute;margin-left:21.55pt;margin-top:9.5pt;width:149.1pt;height:71pt;z-index:-251673600;visibility:visible;mso-wrap-style:square;mso-width-percent:0;mso-height-percent:0;mso-wrap-distance-left:9pt;mso-wrap-distance-top:0;mso-wrap-distance-right:9pt;mso-wrap-distance-bottom:0;mso-position-horizontal:absolute;mso-position-horizontal-relative:text;mso-position-vertical:absolute;mso-position-vertical-relative:text;mso-width-percent:0;mso-height-percent:0;mso-width-relative:page;mso-height-relative:page;v-text-anchor:top" o:gfxdata="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" o:allowincell="f">
+              <v:oval w14:anchorId="477F5A0B" id="Oval 12" o:spid="_x0000_s1026" style="position:absolute;margin-left:21.55pt;margin-top:9.5pt;width:149.1pt;height:71pt;z-index:-251673600;visibility:visible;mso-wrap-style:square;mso-width-percent:0;mso-height-percent:0;mso-wrap-distance-left:9pt;mso-wrap-distance-top:0;mso-wrap-distance-right:9pt;mso-wrap-distance-bottom:0;mso-position-horizontal:absolute;mso-position-horizontal-relative:text;mso-position-vertical:absolute;mso-position-vertical-relative:text;mso-width-percent:0;mso-height-percent:0;mso-width-relative:page;mso-height-relative:page;v-text-anchor:top" o:gfxdata="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" o:allowincell="f">
                 <v:path arrowok="t"/>
               </v:oval>
             </w:pict>
@@ -20852,7 +20733,7 @@
           </mc:Choice>
           <mc:Fallback>
             <w:pict>
-              <v:oval w14:anchorId="03E6D91F" id="Oval 53" o:spid="_x0000_s1026" style="position:absolute;margin-left:50.15pt;margin-top:3.7pt;width:90pt;height:54pt;z-index:-251640832;visibility:visible;mso-wrap-style:square;mso-width-percent:0;mso-height-percent:0;mso-wrap-distance-left:9pt;mso-wrap-distance-top:0;mso-wrap-distance-right:9pt;mso-wrap-distance-bottom:0;mso-position-horizontal:absolute;mso-position-horizontal-relative:text;mso-position-vertical:absolute;mso-position-vertical-relative:text;mso-width-percent:0;mso-height-percent:0;mso-width-relative:page;mso-height-relative:page;v-text-anchor:top" o:gfxdata="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" o:allowincell="f">
+              <v:oval w14:anchorId="53249B81" id="Oval 53" o:spid="_x0000_s1026" style="position:absolute;margin-left:50.15pt;margin-top:3.7pt;width:90pt;height:54pt;z-index:-251640832;visibility:visible;mso-wrap-style:square;mso-width-percent:0;mso-height-percent:0;mso-wrap-distance-left:9pt;mso-wrap-distance-top:0;mso-wrap-distance-right:9pt;mso-wrap-distance-bottom:0;mso-position-horizontal:absolute;mso-position-horizontal-relative:text;mso-position-vertical:absolute;mso-position-vertical-relative:text;mso-width-percent:0;mso-height-percent:0;mso-width-relative:page;mso-height-relative:page;v-text-anchor:top" o:gfxdata="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" o:allowincell="f">
                 <v:path arrowok="t"/>
               </v:oval>
             </w:pict>
@@ -20931,7 +20812,7 @@
           </mc:Choice>
           <mc:Fallback>
             <w:pict>
-              <v:oval w14:anchorId="43A5CFA5" id="Oval 9" o:spid="_x0000_s1026" style="position:absolute;margin-left:71.25pt;margin-top:8.6pt;width:49.7pt;height:42.6pt;z-index:251641856;visibility:visible;mso-wrap-style:square;mso-width-percent:0;mso-height-percent:0;mso-wrap-distance-left:9pt;mso-wrap-distance-top:0;mso-wrap-distance-right:9pt;mso-wrap-distance-bottom:0;mso-position-horizontal:absolute;mso-position-horizontal-relative:text;mso-position-vertical:absolute;mso-position-vertical-relative:text;mso-width-percent:0;mso-height-percent:0;mso-width-relative:page;mso-height-relative:page;v-text-anchor:top" o:gfxdata="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" o:allowincell="f">
+              <v:oval w14:anchorId="19460997" id="Oval 9" o:spid="_x0000_s1026" style="position:absolute;margin-left:71.25pt;margin-top:8.6pt;width:49.7pt;height:42.6pt;z-index:251641856;visibility:visible;mso-wrap-style:square;mso-width-percent:0;mso-height-percent:0;mso-wrap-distance-left:9pt;mso-wrap-distance-top:0;mso-wrap-distance-right:9pt;mso-wrap-distance-bottom:0;mso-position-horizontal:absolute;mso-position-horizontal-relative:text;mso-position-vertical:absolute;mso-position-vertical-relative:text;mso-width-percent:0;mso-height-percent:0;mso-width-relative:page;mso-height-relative:page;v-text-anchor:top" o:gfxdata="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" o:allowincell="f">
                 <v:path arrowok="t"/>
               </v:oval>
             </w:pict>
@@ -21151,7 +21032,7 @@
           </mc:Choice>
           <mc:Fallback>
             <w:pict>
-              <v:line w14:anchorId="444ACEB1" id="Line 30" o:spid="_x0000_s1026" style="position:absolute;z-index:251659264;visibility:visible;mso-wrap-style:square;mso-width-percent:0;mso-height-percent:0;mso-wrap-distance-left:9pt;mso-wrap-distance-top:0;mso-wrap-distance-right:9pt;mso-wrap-distance-bottom:0;mso-position-horizontal:absolute;mso-position-horizontal-relative:text;mso-position-vertical:absolute;mso-position-vertical-relative:text;mso-width-percent:0;mso-height-percent:0;mso-width-relative:page;mso-height-relative:page" from="21.55pt,-.35pt" to="21.55pt,134.55pt" o:gfxdata="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" o:allowincell="f">
+              <v:line w14:anchorId="406EBEAC" id="Line 30" o:spid="_x0000_s1026" style="position:absolute;z-index:251659264;visibility:visible;mso-wrap-style:square;mso-width-percent:0;mso-height-percent:0;mso-wrap-distance-left:9pt;mso-wrap-distance-top:0;mso-wrap-distance-right:9pt;mso-wrap-distance-bottom:0;mso-position-horizontal:absolute;mso-position-horizontal-relative:text;mso-position-vertical:absolute;mso-position-vertical-relative:text;mso-width-percent:0;mso-height-percent:0;mso-width-relative:page;mso-height-relative:page" from="21.55pt,-.35pt" to="21.55pt,134.55pt" o:gfxdata="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" o:allowincell="f">
                 <o:lock v:ext="edit" shapetype="f"/>
               </v:line>
             </w:pict>
@@ -21233,7 +21114,7 @@
           </mc:Choice>
           <mc:Fallback>
             <w:pict>
-              <v:line w14:anchorId="17EB76FB" id="Line 31" o:spid="_x0000_s1026" style="position:absolute;z-index:251660288;visibility:visible;mso-wrap-style:square;mso-width-percent:0;mso-height-percent:0;mso-wrap-distance-left:9pt;mso-wrap-distance-top:0;mso-wrap-distance-right:9pt;mso-wrap-distance-bottom:0;mso-position-horizontal:absolute;mso-position-horizontal-relative:text;mso-position-vertical:absolute;mso-position-vertical-relative:text;mso-width-percent:0;mso-height-percent:0;mso-width-relative:page;mso-height-relative:page" from="170.65pt,-.35pt" to="170.65pt,134.55pt" o:gfxdata="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" o:allowincell="f">
+              <v:line w14:anchorId="379CD1F0" id="Line 31" o:spid="_x0000_s1026" style="position:absolute;z-index:251660288;visibility:visible;mso-wrap-style:square;mso-width-percent:0;mso-height-percent:0;mso-wrap-distance-left:9pt;mso-wrap-distance-top:0;mso-wrap-distance-right:9pt;mso-wrap-distance-bottom:0;mso-position-horizontal:absolute;mso-position-horizontal-relative:text;mso-position-vertical:absolute;mso-position-vertical-relative:text;mso-width-percent:0;mso-height-percent:0;mso-width-relative:page;mso-height-relative:page" from="170.65pt,-.35pt" to="170.65pt,134.55pt" o:gfxdata="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" o:allowincell="f">
                 <o:lock v:ext="edit" shapetype="f"/>
               </v:line>
             </w:pict>
@@ -21315,7 +21196,7 @@
           </mc:Choice>
           <mc:Fallback>
             <w:pict>
-              <v:line w14:anchorId="678BD730" id="Line 27" o:spid="_x0000_s1026" style="position:absolute;z-index:251656192;visibility:visible;mso-wrap-style:square;mso-width-percent:0;mso-height-percent:0;mso-wrap-distance-left:9pt;mso-wrap-distance-top:0;mso-wrap-distance-right:9pt;mso-wrap-distance-bottom:0;mso-position-horizontal:absolute;mso-position-horizontal-relative:text;mso-position-vertical:absolute;mso-position-vertical-relative:text;mso-width-percent:0;mso-height-percent:0;mso-width-relative:page;mso-height-relative:page" from="49.95pt,-.35pt" to="49.95pt,106.15pt" o:gfxdata="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" o:allowincell="f">
+              <v:line w14:anchorId="38E1D03D" id="Line 27" o:spid="_x0000_s1026" style="position:absolute;z-index:251656192;visibility:visible;mso-wrap-style:square;mso-width-percent:0;mso-height-percent:0;mso-wrap-distance-left:9pt;mso-wrap-distance-top:0;mso-wrap-distance-right:9pt;mso-wrap-distance-bottom:0;mso-position-horizontal:absolute;mso-position-horizontal-relative:text;mso-position-vertical:absolute;mso-position-vertical-relative:text;mso-width-percent:0;mso-height-percent:0;mso-width-relative:page;mso-height-relative:page" from="49.95pt,-.35pt" to="49.95pt,106.15pt" o:gfxdata="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" o:allowincell="f">
                 <o:lock v:ext="edit" shapetype="f"/>
               </v:line>
             </w:pict>
@@ -21397,7 +21278,7 @@
           </mc:Choice>
           <mc:Fallback>
             <w:pict>
-              <v:line w14:anchorId="3FB187F8" id="Line 28" o:spid="_x0000_s1026" style="position:absolute;z-index:251657216;visibility:visible;mso-wrap-style:square;mso-width-percent:0;mso-height-percent:0;mso-wrap-distance-left:9pt;mso-wrap-distance-top:0;mso-wrap-distance-right:9pt;mso-wrap-distance-bottom:0;mso-position-horizontal:absolute;mso-position-horizontal-relative:text;mso-position-vertical:absolute;mso-position-vertical-relative:text;mso-width-percent:0;mso-height-percent:0;mso-width-relative:page;mso-height-relative:page" from="142.25pt,-.35pt" to="142.25pt,106.15pt" o:gfxdata="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" o:allowincell="f">
+              <v:line w14:anchorId="7119FECE" id="Line 28" o:spid="_x0000_s1026" style="position:absolute;z-index:251657216;visibility:visible;mso-wrap-style:square;mso-width-percent:0;mso-height-percent:0;mso-wrap-distance-left:9pt;mso-wrap-distance-top:0;mso-wrap-distance-right:9pt;mso-wrap-distance-bottom:0;mso-position-horizontal:absolute;mso-position-horizontal-relative:text;mso-position-vertical:absolute;mso-position-vertical-relative:text;mso-width-percent:0;mso-height-percent:0;mso-width-relative:page;mso-height-relative:page" from="142.25pt,-.35pt" to="142.25pt,106.15pt" o:gfxdata="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" o:allowincell="f">
                 <o:lock v:ext="edit" shapetype="f"/>
               </v:line>
             </w:pict>
@@ -21479,7 +21360,7 @@
           </mc:Choice>
           <mc:Fallback>
             <w:pict>
-              <v:line w14:anchorId="3069622E" id="Line 25" o:spid="_x0000_s1026" style="position:absolute;z-index:251654144;visibility:visible;mso-wrap-style:square;mso-width-percent:0;mso-height-percent:0;mso-wrap-distance-left:9pt;mso-wrap-distance-top:0;mso-wrap-distance-right:9pt;mso-wrap-distance-bottom:0;mso-position-horizontal:absolute;mso-position-horizontal-relative:text;mso-position-vertical:absolute;mso-position-vertical-relative:text;mso-width-percent:0;mso-height-percent:0;mso-width-relative:page;mso-height-relative:page" from="120.95pt,6.75pt" to="120.95pt,70.65pt" o:gfxdata="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" o:allowincell="f">
+              <v:line w14:anchorId="289AFD06" id="Line 25" o:spid="_x0000_s1026" style="position:absolute;z-index:251654144;visibility:visible;mso-wrap-style:square;mso-width-percent:0;mso-height-percent:0;mso-wrap-distance-left:9pt;mso-wrap-distance-top:0;mso-wrap-distance-right:9pt;mso-wrap-distance-bottom:0;mso-position-horizontal:absolute;mso-position-horizontal-relative:text;mso-position-vertical:absolute;mso-position-vertical-relative:text;mso-width-percent:0;mso-height-percent:0;mso-width-relative:page;mso-height-relative:page" from="120.95pt,6.75pt" to="120.95pt,70.65pt" o:gfxdata="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" o:allowincell="f">
                 <o:lock v:ext="edit" shapetype="f"/>
               </v:line>
             </w:pict>
@@ -21561,7 +21442,7 @@
           </mc:Choice>
           <mc:Fallback>
             <w:pict>
-              <v:line w14:anchorId="73927E90" id="Line 24" o:spid="_x0000_s1026" style="position:absolute;z-index:251653120;visibility:visible;mso-wrap-style:square;mso-width-percent:0;mso-height-percent:0;mso-wrap-distance-left:9pt;mso-wrap-distance-top:0;mso-wrap-distance-right:9pt;mso-wrap-distance-bottom:0;mso-position-horizontal:absolute;mso-position-horizontal-relative:text;mso-position-vertical:absolute;mso-position-vertical-relative:text;mso-width-percent:0;mso-height-percent:0;mso-width-relative:page;mso-height-relative:page" from="71.25pt,6.75pt" to="71.25pt,70.65pt" o:gfxdata="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" o:allowincell="f">
+              <v:line w14:anchorId="42AC5F22" id="Line 24" o:spid="_x0000_s1026" style="position:absolute;z-index:251653120;visibility:visible;mso-wrap-style:square;mso-width-percent:0;mso-height-percent:0;mso-wrap-distance-left:9pt;mso-wrap-distance-top:0;mso-wrap-distance-right:9pt;mso-wrap-distance-bottom:0;mso-position-horizontal:absolute;mso-position-horizontal-relative:text;mso-position-vertical:absolute;mso-position-vertical-relative:text;mso-width-percent:0;mso-height-percent:0;mso-width-relative:page;mso-height-relative:page" from="71.25pt,6.75pt" to="71.25pt,70.65pt" o:gfxdata="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" o:allowincell="f">
                 <o:lock v:ext="edit" shapetype="f"/>
               </v:line>
             </w:pict>
@@ -21680,7 +21561,7 @@
           </mc:Choice>
           <mc:Fallback>
             <w:pict>
-              <v:shapetype w14:anchorId="3E31FD45" id="_x0000_t69" coordsize="21600,21600" o:spt="69" adj="4320,5400" path="m,10800l@0,21600@0@3@2@3@2,21600,21600,10800@2,0@2@1@0@1@0,xe">
+              <v:shapetype w14:anchorId="0D1B14FC" id="_x0000_t69" coordsize="21600,21600" o:spt="69" adj="4320,5400" path="m,10800l@0,21600@0@3@2@3@2,21600,21600,10800@2,0@2@1@0@1@0,xe">
                 <v:stroke joinstyle="miter"/>
                 <v:formulas>
                   <v:f eqn="val #0"/>
@@ -21854,7 +21735,7 @@
           </mc:Choice>
           <mc:Fallback>
             <w:pict>
-              <v:shape w14:anchorId="668FB48B" id="AutoShape 29" o:spid="_x0000_s1026" type="#_x0000_t69" style="position:absolute;margin-left:49.95pt;margin-top:-.6pt;width:92.3pt;height:7.1pt;z-index:251658240;visibility:visible;mso-wrap-style:square;mso-width-percent:0;mso-height-percent:0;mso-wrap-distance-left:9pt;mso-wrap-distance-top:0;mso-wrap-distance-right:9pt;mso-wrap-distance-bottom:0;mso-position-horizontal:absolute;mso-position-horizontal-relative:text;mso-position-vertical:absolute;mso-position-vertical-relative:text;mso-width-percent:0;mso-height-percent:0;mso-width-relative:page;mso-height-relative:page;v-text-anchor:top" o:gfxdata="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" o:allowincell="f">
+              <v:shape w14:anchorId="5211A6F3" id="AutoShape 29" o:spid="_x0000_s1026" type="#_x0000_t69" style="position:absolute;margin-left:49.95pt;margin-top:-.6pt;width:92.3pt;height:7.1pt;z-index:251658240;visibility:visible;mso-wrap-style:square;mso-width-percent:0;mso-height-percent:0;mso-wrap-distance-left:9pt;mso-wrap-distance-top:0;mso-wrap-distance-right:9pt;mso-wrap-distance-bottom:0;mso-position-horizontal:absolute;mso-position-horizontal-relative:text;mso-position-vertical:absolute;mso-position-vertical-relative:text;mso-width-percent:0;mso-height-percent:0;mso-width-relative:page;mso-height-relative:page;v-text-anchor:top" o:gfxdata="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" o:allowincell="f">
                 <v:path arrowok="t"/>
               </v:shape>
             </w:pict>
@@ -21946,7 +21827,7 @@
           </mc:Choice>
           <mc:Fallback>
             <w:pict>
-              <v:shape w14:anchorId="4A2F70F6" id="AutoShape 32" o:spid="_x0000_s1026" type="#_x0000_t69" style="position:absolute;margin-left:21.55pt;margin-top:13.6pt;width:149.1pt;height:7.1pt;z-index:251661312;visibility:visible;mso-wrap-style:square;mso-width-percent:0;mso-height-percent:0;mso-wrap-distance-left:9pt;mso-wrap-distance-top:0;mso-wrap-distance-right:9pt;mso-wrap-distance-bottom:0;mso-position-horizontal:absolute;mso-position-horizontal-relative:text;mso-position-vertical:absolute;mso-position-vertical-relative:text;mso-width-percent:0;mso-height-percent:0;mso-width-relative:page;mso-height-relative:page;v-text-anchor:top" o:gfxdata="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" o:allowincell="f">
+              <v:shape w14:anchorId="5945CC0C" id="AutoShape 32" o:spid="_x0000_s1026" type="#_x0000_t69" style="position:absolute;margin-left:21.55pt;margin-top:13.6pt;width:149.1pt;height:7.1pt;z-index:251661312;visibility:visible;mso-wrap-style:square;mso-width-percent:0;mso-height-percent:0;mso-wrap-distance-left:9pt;mso-wrap-distance-top:0;mso-wrap-distance-right:9pt;mso-wrap-distance-bottom:0;mso-position-horizontal:absolute;mso-position-horizontal-relative:text;mso-position-vertical:absolute;mso-position-vertical-relative:text;mso-width-percent:0;mso-height-percent:0;mso-width-relative:page;mso-height-relative:page;v-text-anchor:top" o:gfxdata="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" o:allowincell="f">
                 <v:path arrowok="t"/>
               </v:shape>
             </w:pict>
@@ -22267,7 +22148,7 @@
           </mc:Choice>
           <mc:Fallback>
             <w:pict>
-              <v:line w14:anchorId="0478C495" id="Line 43" o:spid="_x0000_s1026" style="position:absolute;flip:x;z-index:251667456;visibility:visible;mso-wrap-style:square;mso-width-percent:0;mso-height-percent:0;mso-wrap-distance-left:9pt;mso-wrap-distance-top:0;mso-wrap-distance-right:9pt;mso-wrap-distance-bottom:0;mso-position-horizontal:absolute;mso-position-horizontal-relative:text;mso-position-vertical:absolute;mso-position-vertical-relative:text;mso-width-percent:0;mso-height-percent:0;mso-width-relative:page;mso-height-relative:page" from="57.05pt,13.3pt" to="92.55pt,27.5pt" o:gfxdata="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" o:allowincell="f">
+              <v:line w14:anchorId="4157C5BE" id="Line 43" o:spid="_x0000_s1026" style="position:absolute;flip:x;z-index:251667456;visibility:visible;mso-wrap-style:square;mso-width-percent:0;mso-height-percent:0;mso-wrap-distance-left:9pt;mso-wrap-distance-top:0;mso-wrap-distance-right:9pt;mso-wrap-distance-bottom:0;mso-position-horizontal:absolute;mso-position-horizontal-relative:text;mso-position-vertical:absolute;mso-position-vertical-relative:text;mso-width-percent:0;mso-height-percent:0;mso-width-relative:page;mso-height-relative:page" from="57.05pt,13.3pt" to="92.55pt,27.5pt" o:gfxdata="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" o:allowincell="f">
                 <v:stroke endarrow="block"/>
                 <o:lock v:ext="edit" shapetype="f"/>
               </v:line>
@@ -22365,7 +22246,7 @@
           </mc:Choice>
           <mc:Fallback>
             <w:pict>
-              <v:line w14:anchorId="21126015" id="Line 41" o:spid="_x0000_s1026" style="position:absolute;flip:x y;z-index:251666432;visibility:visible;mso-wrap-style:square;mso-width-percent:0;mso-height-percent:0;mso-wrap-distance-left:9pt;mso-wrap-distance-top:0;mso-wrap-distance-right:9pt;mso-wrap-distance-bottom:0;mso-position-horizontal:absolute;mso-position-horizontal-relative:text;mso-position-vertical:absolute;mso-position-vertical-relative:text;mso-width-percent:0;mso-height-percent:0;mso-width-relative:page;mso-height-relative:page" from="42.85pt,4.4pt" to="78.35pt,25.7pt" o:gfxdata="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" o:allowincell="f">
+              <v:line w14:anchorId="276798DC" id="Line 41" o:spid="_x0000_s1026" style="position:absolute;flip:x y;z-index:251666432;visibility:visible;mso-wrap-style:square;mso-width-percent:0;mso-height-percent:0;mso-wrap-distance-left:9pt;mso-wrap-distance-top:0;mso-wrap-distance-right:9pt;mso-wrap-distance-bottom:0;mso-position-horizontal:absolute;mso-position-horizontal-relative:text;mso-position-vertical:absolute;mso-position-vertical-relative:text;mso-width-percent:0;mso-height-percent:0;mso-width-relative:page;mso-height-relative:page" from="42.85pt,4.4pt" to="78.35pt,25.7pt" o:gfxdata="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" o:allowincell="f">
                 <o:lock v:ext="edit" shapetype="f"/>
               </v:line>
             </w:pict>
@@ -22701,7 +22582,7 @@
           </mc:Choice>
           <mc:Fallback>
             <w:pict>
-              <v:shape w14:anchorId="0979F42B" id="Freeform 34" o:spid="_x0000_s1026" style="position:absolute;margin-left:23.9pt;margin-top:6.75pt;width:112.3pt;height:37.8pt;z-index:-251654144;visibility:visible;mso-wrap-style:square;mso-width-percent:0;mso-height-percent:0;mso-wrap-distance-left:9pt;mso-wrap-distance-top:0;mso-wrap-distance-right:9pt;mso-wrap-distance-bottom:0;mso-position-horizontal:absolute;mso-position-horizontal-relative:text;mso-position-vertical:absolute;mso-position-vertical-relative:text;mso-width-percent:0;mso-height-percent:0;mso-width-relative:page;mso-height-relative:page;v-text-anchor:top" coordsize="2246,756" o:gfxdata="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" o:allowincell="f" path="m223,431v94,-94,38,-59,171,-103c414,321,426,297,446,294,548,279,651,282,754,276v34,-11,69,-23,103,-34c872,237,878,216,892,208v15,-9,34,-11,51,-17c1048,83,859,266,1080,122v17,-11,33,-26,52,-34c1165,74,1200,65,1234,54v17,-6,52,-18,52,-18c1480,56,1455,65,1663,36,1721,28,1834,2,1834,2v225,17,252,-2,395,137c2235,156,2246,173,2246,191v,251,-224,177,-429,188c1752,445,1671,500,1594,551v-39,26,-180,54,-222,68c1245,661,1127,700,994,722,982,721,822,718,772,688v-14,-8,-22,-24,-35,-34c641,582,664,595,583,568,364,577,197,522,52,671,29,737,47,709,,756l223,431xe">
+              <v:shape w14:anchorId="20C10CDD" id="Freeform 34" o:spid="_x0000_s1026" style="position:absolute;margin-left:23.9pt;margin-top:6.75pt;width:112.3pt;height:37.8pt;z-index:-251654144;visibility:visible;mso-wrap-style:square;mso-width-percent:0;mso-height-percent:0;mso-wrap-distance-left:9pt;mso-wrap-distance-top:0;mso-wrap-distance-right:9pt;mso-wrap-distance-bottom:0;mso-position-horizontal:absolute;mso-position-horizontal-relative:text;mso-position-vertical:absolute;mso-position-vertical-relative:text;mso-width-percent:0;mso-height-percent:0;mso-width-relative:page;mso-height-relative:page;v-text-anchor:top" coordsize="2246,756" o:gfxdata="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" o:allowincell="f" path="m223,431v94,-94,38,-59,171,-103c414,321,426,297,446,294,548,279,651,282,754,276v34,-11,69,-23,103,-34c872,237,878,216,892,208v15,-9,34,-11,51,-17c1048,83,859,266,1080,122v17,-11,33,-26,52,-34c1165,74,1200,65,1234,54v17,-6,52,-18,52,-18c1480,56,1455,65,1663,36,1721,28,1834,2,1834,2v225,17,252,-2,395,137c2235,156,2246,173,2246,191v,251,-224,177,-429,188c1752,445,1671,500,1594,551v-39,26,-180,54,-222,68c1245,661,1127,700,994,722,982,721,822,718,772,688v-14,-8,-22,-24,-35,-34c641,582,664,595,583,568,364,577,197,522,52,671,29,737,47,709,,756l223,431xe">
                 <v:path arrowok="t" o:connecttype="custom" o:connectlocs="141605,273685;250190,208280;283210,186690;478790,175260;544195,153670;566420,132080;598805,121285;685800,77470;718820,55880;783590,34290;816610,22860;1056005,22860;1164590,1270;1415415,88265;1426210,121285;1153795,240665;1012190,349885;871220,393065;631190,458470;490220,436880;467995,415290;370205,360680;33020,426085;0,480060;141605,273685" o:connectangles="0,0,0,0,0,0,0,0,0,0,0,0,0,0,0,0,0,0,0,0,0,0,0,0,0"/>
               </v:shape>
             </w:pict>
@@ -22817,7 +22698,7 @@
           </mc:Choice>
           <mc:Fallback>
             <w:pict>
-              <v:line w14:anchorId="346A6E08" id="Line 45" o:spid="_x0000_s1026" style="position:absolute;flip:x;z-index:251668480;visibility:visible;mso-wrap-style:square;mso-width-percent:0;mso-height-percent:0;mso-wrap-distance-left:9pt;mso-wrap-distance-top:0;mso-wrap-distance-right:9pt;mso-wrap-distance-bottom:0;mso-position-horizontal:absolute;mso-position-horizontal-relative:text;mso-position-vertical:absolute;mso-position-vertical-relative:text;mso-width-percent:0;mso-height-percent:0;mso-width-relative:page;mso-height-relative:page" from="106.75pt,11.5pt" to="156.45pt,18.6pt" o:gfxdata="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" o:allowincell="f">
+              <v:line w14:anchorId="5E228533" id="Line 45" o:spid="_x0000_s1026" style="position:absolute;flip:x;z-index:251668480;visibility:visible;mso-wrap-style:square;mso-width-percent:0;mso-height-percent:0;mso-wrap-distance-left:9pt;mso-wrap-distance-top:0;mso-wrap-distance-right:9pt;mso-wrap-distance-bottom:0;mso-position-horizontal:absolute;mso-position-horizontal-relative:text;mso-position-vertical:absolute;mso-position-vertical-relative:text;mso-width-percent:0;mso-height-percent:0;mso-width-relative:page;mso-height-relative:page" from="106.75pt,11.5pt" to="156.45pt,18.6pt" o:gfxdata="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" o:allowincell="f">
                 <v:stroke endarrow="block"/>
                 <o:lock v:ext="edit" shapetype="f"/>
               </v:line>
@@ -22897,7 +22778,7 @@
           </mc:Choice>
           <mc:Fallback>
             <w:pict>
-              <v:shapetype w14:anchorId="2B9DBE63" id="_x0000_t132" coordsize="21600,21600" o:spt="132" path="m10800,qx,3391l,18209qy10800,21600,21600,18209l21600,3391qy10800,xem,3391nfqy10800,6782,21600,3391e">
+              <v:shapetype w14:anchorId="3F938D5E" id="_x0000_t132" coordsize="21600,21600" o:spt="132" path="m10800,qx,3391l,18209qy10800,21600,21600,18209l21600,3391qy10800,xem,3391nfqy10800,6782,21600,3391e">
                 <v:path o:extrusionok="f" gradientshapeok="t" o:connecttype="custom" o:connectlocs="10800,6782;10800,0;0,10800;10800,21600;21600,10800" o:connectangles="270,270,180,90,0" textboxrect="0,6782,21600,18209"/>
               </v:shapetype>
               <v:shape id="AutoShape 38" o:spid="_x0000_s1026" type="#_x0000_t132" style="position:absolute;margin-left:71.25pt;margin-top:1.9pt;width:14.2pt;height:85.2pt;rotation:938094fd;z-index:251664384;visibility:visible;mso-wrap-style:square;mso-width-percent:0;mso-height-percent:0;mso-wrap-distance-left:9pt;mso-wrap-distance-top:0;mso-wrap-distance-right:9pt;mso-wrap-distance-bottom:0;mso-position-horizontal:absolute;mso-position-horizontal-relative:text;mso-position-vertical:absolute;mso-position-vertical-relative:text;mso-width-percent:0;mso-height-percent:0;mso-width-relative:page;mso-height-relative:page;v-text-anchor:top" o:gfxdata="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" o:allowincell="f">
@@ -23006,7 +22887,7 @@
           </mc:Choice>
           <mc:Fallback>
             <w:pict>
-              <v:line w14:anchorId="53D3C4A3" id="Line 46" o:spid="_x0000_s1026" style="position:absolute;flip:x;z-index:251669504;visibility:visible;mso-wrap-style:square;mso-width-percent:0;mso-height-percent:0;mso-wrap-distance-left:9pt;mso-wrap-distance-top:0;mso-wrap-distance-right:9pt;mso-wrap-distance-bottom:0;mso-position-horizontal:absolute;mso-position-horizontal-relative:text;mso-position-vertical:absolute;mso-position-vertical-relative:text;mso-width-percent:0;mso-height-percent:0;mso-width-relative:page;mso-height-relative:page" from="86.25pt,11.1pt" to="114.65pt,18.2pt" o:gfxdata="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" o:allowincell="f">
+              <v:line w14:anchorId="0040CE3C" id="Line 46" o:spid="_x0000_s1026" style="position:absolute;flip:x;z-index:251669504;visibility:visible;mso-wrap-style:square;mso-width-percent:0;mso-height-percent:0;mso-wrap-distance-left:9pt;mso-wrap-distance-top:0;mso-wrap-distance-right:9pt;mso-wrap-distance-bottom:0;mso-position-horizontal:absolute;mso-position-horizontal-relative:text;mso-position-vertical:absolute;mso-position-vertical-relative:text;mso-width-percent:0;mso-height-percent:0;mso-width-relative:page;mso-height-relative:page" from="86.25pt,11.1pt" to="114.65pt,18.2pt" o:gfxdata="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" o:allowincell="f">
                 <v:stroke endarrow="block"/>
                 <o:lock v:ext="edit" shapetype="f"/>
               </v:line>
@@ -23116,7 +22997,7 @@
           </mc:Choice>
           <mc:Fallback>
             <w:pict>
-              <v:oval w14:anchorId="68042F70" id="Oval 37" o:spid="_x0000_s1026" style="position:absolute;margin-left:21.55pt;margin-top:.7pt;width:92.3pt;height:42.6pt;z-index:-251653120;visibility:visible;mso-wrap-style:square;mso-width-percent:0;mso-height-percent:0;mso-wrap-distance-left:9pt;mso-wrap-distance-top:0;mso-wrap-distance-right:9pt;mso-wrap-distance-bottom:0;mso-position-horizontal:absolute;mso-position-horizontal-relative:text;mso-position-vertical:absolute;mso-position-vertical-relative:text;mso-width-percent:0;mso-height-percent:0;mso-width-relative:page;mso-height-relative:page;v-text-anchor:top" o:gfxdata="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" o:allowincell="f">
+              <v:oval w14:anchorId="45F02DF9" id="Oval 37" o:spid="_x0000_s1026" style="position:absolute;margin-left:21.55pt;margin-top:.7pt;width:92.3pt;height:42.6pt;z-index:-251653120;visibility:visible;mso-wrap-style:square;mso-width-percent:0;mso-height-percent:0;mso-wrap-distance-left:9pt;mso-wrap-distance-top:0;mso-wrap-distance-right:9pt;mso-wrap-distance-bottom:0;mso-position-horizontal:absolute;mso-position-horizontal-relative:text;mso-position-vertical:absolute;mso-position-vertical-relative:text;mso-width-percent:0;mso-height-percent:0;mso-width-relative:page;mso-height-relative:page;v-text-anchor:top" o:gfxdata="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" o:allowincell="f">
                 <v:path arrowok="t"/>
                 <w10:wrap type="square"/>
               </v:oval>
@@ -23208,7 +23089,7 @@
           </mc:Choice>
           <mc:Fallback>
             <w:pict>
-              <v:line w14:anchorId="77EC9766" id="Line 47" o:spid="_x0000_s1026" style="position:absolute;flip:x;z-index:251670528;visibility:visible;mso-wrap-style:square;mso-width-percent:0;mso-height-percent:0;mso-wrap-distance-left:9pt;mso-wrap-distance-top:0;mso-wrap-distance-right:9pt;mso-wrap-distance-bottom:0;mso-position-horizontal:absolute;mso-position-horizontal-relative:text;mso-position-vertical:absolute;mso-position-vertical-relative:text;mso-width-percent:0;mso-height-percent:0;mso-width-relative:page;mso-height-relative:page" from="-9.3pt,14pt" to="12pt,14pt" o:gfxdata="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" o:allowincell="f">
+              <v:line w14:anchorId="2D3E4F08" id="Line 47" o:spid="_x0000_s1026" style="position:absolute;flip:x;z-index:251670528;visibility:visible;mso-wrap-style:square;mso-width-percent:0;mso-height-percent:0;mso-wrap-distance-left:9pt;mso-wrap-distance-top:0;mso-wrap-distance-right:9pt;mso-wrap-distance-bottom:0;mso-position-horizontal:absolute;mso-position-horizontal-relative:text;mso-position-vertical:absolute;mso-position-vertical-relative:text;mso-width-percent:0;mso-height-percent:0;mso-width-relative:page;mso-height-relative:page" from="-9.3pt,14pt" to="12pt,14pt" o:gfxdata="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" o:allowincell="f">
                 <v:stroke endarrow="block"/>
                 <o:lock v:ext="edit" shapetype="f"/>
               </v:line>
@@ -23848,10 +23729,10 @@
       </w:pPr>
     </w:p>
     <w:sectPr>
-      <w:headerReference w:type="even" r:id="rId7"/>
-      <w:headerReference w:type="default" r:id="rId8"/>
-      <w:footerReference w:type="even" r:id="rId9"/>
-      <w:footerReference w:type="default" r:id="rId10"/>
+      <w:headerReference w:type="even" r:id="rId6"/>
+      <w:headerReference w:type="default" r:id="rId7"/>
+      <w:footerReference w:type="even" r:id="rId8"/>
+      <w:footerReference w:type="default" r:id="rId9"/>
       <w:pgSz w:w="11907" w:h="16273" w:code="9"/>
       <w:pgMar w:top="907" w:right="1418" w:bottom="907" w:left="1418" w:header="720" w:footer="720" w:gutter="0"/>
       <w:pgBorders>
@@ -25021,16 +24902,4 @@
     </a:ext>
   </a:extLst>
 </a:theme>
-</file>
-
-<file path=customXml/item1.xml><?xml version="1.0" encoding="utf-8"?>
-<b:Sources xmlns:b="http://schemas.openxmlformats.org/officeDocument/2006/bibliography" xmlns="http://schemas.openxmlformats.org/officeDocument/2006/bibliography" SelectedStyle="\APA.XSL" StyleName="APA"/>
-</file>
-
-<file path=customXml/itemProps1.xml><?xml version="1.0" encoding="utf-8"?>
-<ds:datastoreItem xmlns:ds="http://schemas.openxmlformats.org/officeDocument/2006/customXml" ds:itemID="{CE25CF20-F74F-42B9-9CFF-54F87D4ADF15}">
-  <ds:schemaRefs>
-    <ds:schemaRef ds:uri="http://schemas.openxmlformats.org/officeDocument/2006/bibliography"/>
-  </ds:schemaRefs>
-</ds:datastoreItem>
 </file>
</xml_diff>